<commit_message>
Atualização da documentação, readme.
</commit_message>
<xml_diff>
--- a/Manual_Desenvolvedor_Achados_e_Perdidos.docx
+++ b/Manual_Desenvolvedor_Achados_e_Perdidos.docx
@@ -104,8 +104,21 @@
       <w:pPr>
         <w:jc w:val="both"/>
       </w:pPr>
-      <w:r>
-        <w:t>Achados &amp; Perdidos é uma plataforma digital para registrar objetos achados e perdidos, facilitando a devolução ao dono. A aplicação é composta por vários subsistemas:</w:t>
+      <w:proofErr w:type="spellStart"/>
+      <w:r>
+        <w:t>Achados</w:t>
+      </w:r>
+      <w:proofErr w:type="spellEnd"/>
+      <w:r>
+        <w:t xml:space="preserve"> &amp; </w:t>
+      </w:r>
+      <w:proofErr w:type="spellStart"/>
+      <w:r>
+        <w:t>Perdidos</w:t>
+      </w:r>
+      <w:proofErr w:type="spellEnd"/>
+      <w:r>
+        <w:t xml:space="preserve"> é uma plataforma digital para registrar objetos achados e perdidos, facilitando a devolução ao dono. A aplicação é composta por vários subsistemas:</w:t>
       </w:r>
     </w:p>
     <w:p>
@@ -145,15 +158,460 @@
         <w:pStyle w:val="Commarcadores"/>
       </w:pPr>
       <w:r>
-        <w:t>Ollama: Serviço responsável por executar o modelo de linguagem localmente.</w:t>
+        <w:t xml:space="preserve">Ollama: Serviço responsável por executar o </w:t>
+      </w:r>
+      <w:proofErr w:type="spellStart"/>
+      <w:r>
+        <w:t>modelo</w:t>
+      </w:r>
+      <w:proofErr w:type="spellEnd"/>
+      <w:r>
+        <w:t xml:space="preserve"> de </w:t>
+      </w:r>
+      <w:proofErr w:type="spellStart"/>
+      <w:r>
+        <w:t>linguagem</w:t>
+      </w:r>
+      <w:proofErr w:type="spellEnd"/>
+      <w:r>
+        <w:t xml:space="preserve"> </w:t>
+      </w:r>
+      <w:proofErr w:type="spellStart"/>
+      <w:r>
+        <w:t>localmente</w:t>
+      </w:r>
+      <w:proofErr w:type="spellEnd"/>
+      <w:r>
+        <w:t>.</w:t>
       </w:r>
     </w:p>
     <w:p>
       <w:pPr>
+        <w:pStyle w:val="Commarcadores"/>
+        <w:numPr>
+          <w:ilvl w:val="0"/>
+          <w:numId w:val="0"/>
+        </w:numPr>
+        <w:ind w:left="360" w:hanging="360"/>
+      </w:pPr>
+    </w:p>
+    <w:p>
+      <w:pPr>
+        <w:pStyle w:val="Commarcadores"/>
+        <w:numPr>
+          <w:ilvl w:val="0"/>
+          <w:numId w:val="0"/>
+        </w:numPr>
+        <w:ind w:left="360" w:hanging="360"/>
+      </w:pPr>
+    </w:p>
+    <w:p>
+      <w:pPr>
+        <w:pStyle w:val="Commarcadores"/>
+        <w:numPr>
+          <w:ilvl w:val="0"/>
+          <w:numId w:val="14"/>
+        </w:numPr>
+        <w:rPr>
+          <w:lang w:val="pt-BR"/>
+        </w:rPr>
+      </w:pPr>
+      <w:r>
+        <w:rPr>
+          <w:b/>
+          <w:bCs/>
+          <w:color w:val="4F81BD" w:themeColor="accent1"/>
+          <w:lang w:val="pt-BR"/>
+        </w:rPr>
+        <w:t>DIRETRIZES PARA DEPLOY EM SERVIDOR PARTILHADO (EVITANDO CONFLITOS DE PORTAS)</w:t>
+      </w:r>
+      <w:r>
+        <w:rPr>
+          <w:lang w:val="pt-BR"/>
+        </w:rPr>
+        <w:t xml:space="preserve"> </w:t>
+      </w:r>
+    </w:p>
+    <w:p>
+      <w:pPr>
+        <w:pStyle w:val="Commarcadores"/>
+        <w:numPr>
+          <w:ilvl w:val="0"/>
+          <w:numId w:val="0"/>
+        </w:numPr>
+        <w:ind w:left="360"/>
+        <w:rPr>
+          <w:lang w:val="pt-BR"/>
+        </w:rPr>
+      </w:pPr>
+      <w:r>
+        <w:rPr>
+          <w:lang w:val="pt-BR"/>
+        </w:rPr>
+        <w:t xml:space="preserve">A meta central deste guia é garantir que qualquer pessoa, mesmo sem conhecimento prévio do projeto, consiga realizar o </w:t>
+      </w:r>
+      <w:proofErr w:type="spellStart"/>
+      <w:r>
+        <w:rPr>
+          <w:lang w:val="pt-BR"/>
+        </w:rPr>
+        <w:t>deploy</w:t>
+      </w:r>
+      <w:proofErr w:type="spellEnd"/>
+      <w:r>
+        <w:rPr>
+          <w:lang w:val="pt-BR"/>
+        </w:rPr>
+        <w:t xml:space="preserve"> da aplicação num servidor de produção (como o ambiente institucional do CEFET) que já possua outros sistemas e serviços em execução.</w:t>
+      </w:r>
+    </w:p>
+    <w:p>
+      <w:pPr>
+        <w:pStyle w:val="Commarcadores"/>
+        <w:rPr>
+          <w:lang w:val="pt-BR"/>
+        </w:rPr>
+      </w:pPr>
+      <w:r>
+        <w:rPr>
+          <w:lang w:val="pt-BR"/>
+        </w:rPr>
+        <w:t>Para evitar conflitos de portas e garantir o isolamento da aplicação, a infraestrutura foi projetada utilizando contêineres Docker virtuais que restringem o acesso externo apenas ao estritamente necessário.</w:t>
+      </w:r>
+    </w:p>
+    <w:p>
+      <w:pPr>
+        <w:pStyle w:val="Commarcadores"/>
+        <w:rPr>
+          <w:lang w:val="pt-BR"/>
+        </w:rPr>
+      </w:pPr>
+      <w:r>
+        <w:rPr>
+          <w:lang w:val="pt-BR"/>
+        </w:rPr>
+        <w:t>O mapeamento de portas no Docker funciona sob a sintaxe "PORTA_DO_SERVIDOR:PORTA_DO_CONTAINER". Em ambientes partilhados, as portas internas dos contêineres permanecem fixas, alterando-se apenas as portas do servidor (Host) caso haja conflito com outro sistema.</w:t>
+      </w:r>
+    </w:p>
+    <w:p>
+      <w:pPr>
+        <w:pStyle w:val="Commarcadores"/>
+        <w:rPr>
+          <w:lang w:val="pt-BR"/>
+        </w:rPr>
+      </w:pPr>
+      <w:r>
+        <w:rPr>
+          <w:lang w:val="pt-BR"/>
+        </w:rPr>
+        <w:t xml:space="preserve">Abaixo está a estrutura de isolamento adotada para o </w:t>
+      </w:r>
+      <w:proofErr w:type="spellStart"/>
+      <w:r>
+        <w:rPr>
+          <w:lang w:val="pt-BR"/>
+        </w:rPr>
+        <w:t>deploy</w:t>
+      </w:r>
+      <w:proofErr w:type="spellEnd"/>
+      <w:r>
+        <w:rPr>
+          <w:lang w:val="pt-BR"/>
+        </w:rPr>
+        <w:t>:</w:t>
+      </w:r>
+    </w:p>
+    <w:p>
+      <w:pPr>
+        <w:pStyle w:val="Commarcadores"/>
+        <w:numPr>
+          <w:ilvl w:val="0"/>
+          <w:numId w:val="15"/>
+        </w:numPr>
+        <w:rPr>
+          <w:lang w:val="pt-BR"/>
+        </w:rPr>
+      </w:pPr>
+      <w:proofErr w:type="spellStart"/>
+      <w:r>
+        <w:rPr>
+          <w:lang w:val="pt-BR"/>
+        </w:rPr>
+        <w:t>Frontend</w:t>
+      </w:r>
+      <w:proofErr w:type="spellEnd"/>
+      <w:r>
+        <w:rPr>
+          <w:lang w:val="pt-BR"/>
+        </w:rPr>
+        <w:t xml:space="preserve"> Container (</w:t>
+      </w:r>
+      <w:proofErr w:type="spellStart"/>
+      <w:r>
+        <w:rPr>
+          <w:lang w:val="pt-BR"/>
+        </w:rPr>
+        <w:t>React</w:t>
+      </w:r>
+      <w:proofErr w:type="spellEnd"/>
+      <w:r>
+        <w:rPr>
+          <w:lang w:val="pt-BR"/>
+        </w:rPr>
+        <w:t>) -&gt; Mapeamento: 5173:5173 Status: Aberta para o mundo exterior. Permite o acesso direto dos usuários à interface Web.</w:t>
+      </w:r>
+    </w:p>
+    <w:p>
+      <w:pPr>
+        <w:pStyle w:val="Commarcadores"/>
+        <w:numPr>
+          <w:ilvl w:val="0"/>
+          <w:numId w:val="15"/>
+        </w:numPr>
+        <w:rPr>
+          <w:lang w:val="pt-BR"/>
+        </w:rPr>
+      </w:pPr>
+      <w:proofErr w:type="spellStart"/>
+      <w:r>
+        <w:rPr>
+          <w:lang w:val="pt-BR"/>
+        </w:rPr>
+        <w:t>Backend</w:t>
+      </w:r>
+      <w:proofErr w:type="spellEnd"/>
+      <w:r>
+        <w:rPr>
+          <w:lang w:val="pt-BR"/>
+        </w:rPr>
+        <w:t xml:space="preserve"> Container (Spring Boot) -&gt; Mapeamento: 8080:8080 Status: Aberta para o mundo exterior. Necessária para receber requisições HTTP da API e manter a conexão </w:t>
+      </w:r>
+      <w:proofErr w:type="spellStart"/>
+      <w:r>
+        <w:rPr>
+          <w:lang w:val="pt-BR"/>
+        </w:rPr>
+        <w:t>WebSocket</w:t>
+      </w:r>
+      <w:proofErr w:type="spellEnd"/>
+      <w:r>
+        <w:rPr>
+          <w:lang w:val="pt-BR"/>
+        </w:rPr>
+        <w:t xml:space="preserve"> </w:t>
+      </w:r>
+      <w:proofErr w:type="spellStart"/>
+      <w:r>
+        <w:rPr>
+          <w:lang w:val="pt-BR"/>
+        </w:rPr>
+        <w:t>activa</w:t>
+      </w:r>
+      <w:proofErr w:type="spellEnd"/>
+      <w:r>
+        <w:rPr>
+          <w:lang w:val="pt-BR"/>
+        </w:rPr>
+        <w:t xml:space="preserve"> para o Chat.</w:t>
+      </w:r>
+    </w:p>
+    <w:p>
+      <w:pPr>
+        <w:pStyle w:val="Commarcadores"/>
+        <w:numPr>
+          <w:ilvl w:val="0"/>
+          <w:numId w:val="15"/>
+        </w:numPr>
+        <w:rPr>
+          <w:lang w:val="pt-BR"/>
+        </w:rPr>
+      </w:pPr>
+      <w:r>
+        <w:rPr>
+          <w:lang w:val="pt-BR"/>
+        </w:rPr>
+        <w:t>Match API (Python/</w:t>
+      </w:r>
+      <w:proofErr w:type="spellStart"/>
+      <w:r>
+        <w:rPr>
+          <w:lang w:val="pt-BR"/>
+        </w:rPr>
+        <w:t>Flask</w:t>
+      </w:r>
+      <w:proofErr w:type="spellEnd"/>
+      <w:r>
+        <w:rPr>
+          <w:lang w:val="pt-BR"/>
+        </w:rPr>
+        <w:t xml:space="preserve">) -&gt; Sem mapeamento externo (Exposta apenas internamente na porta 5001). Status: Bloqueada para a internet. Comunica apenas com o </w:t>
+      </w:r>
+      <w:proofErr w:type="spellStart"/>
+      <w:r>
+        <w:rPr>
+          <w:lang w:val="pt-BR"/>
+        </w:rPr>
+        <w:t>Backend</w:t>
+      </w:r>
+      <w:proofErr w:type="spellEnd"/>
+      <w:r>
+        <w:rPr>
+          <w:lang w:val="pt-BR"/>
+        </w:rPr>
+        <w:t xml:space="preserve"> dentro da rede interna do Docker.</w:t>
+      </w:r>
+    </w:p>
+    <w:p>
+      <w:pPr>
+        <w:pStyle w:val="Commarcadores"/>
+        <w:numPr>
+          <w:ilvl w:val="0"/>
+          <w:numId w:val="15"/>
+        </w:numPr>
+        <w:rPr>
+          <w:lang w:val="pt-BR"/>
+        </w:rPr>
+      </w:pPr>
+      <w:proofErr w:type="spellStart"/>
+      <w:r>
+        <w:rPr>
+          <w:lang w:val="pt-BR"/>
+        </w:rPr>
+        <w:lastRenderedPageBreak/>
+        <w:t>Ollama</w:t>
+      </w:r>
+      <w:proofErr w:type="spellEnd"/>
+      <w:r>
+        <w:rPr>
+          <w:lang w:val="pt-BR"/>
+        </w:rPr>
+        <w:t xml:space="preserve"> (IA Local) -&gt; Sem mapeamento externo (Exposta apenas internamente na porta 11434). Status: Bloqueada para a internet. Protege o modelo de IA contra acessos não autorizados.</w:t>
+      </w:r>
+    </w:p>
+    <w:p>
+      <w:pPr>
+        <w:pStyle w:val="Commarcadores"/>
+        <w:numPr>
+          <w:ilvl w:val="0"/>
+          <w:numId w:val="15"/>
+        </w:numPr>
+        <w:rPr>
+          <w:lang w:val="pt-BR"/>
+        </w:rPr>
+      </w:pPr>
+      <w:r>
+        <w:rPr>
+          <w:lang w:val="pt-BR"/>
+        </w:rPr>
+        <w:t>Banco PostgreSQL -&gt; Sem mapeamento externo (Exposta apenas internamente na porta 5432). Status: Bloqueada para a internet. Garante a segurança dos dados estruturados.</w:t>
+      </w:r>
+    </w:p>
+    <w:p>
+      <w:pPr>
+        <w:pStyle w:val="Commarcadores"/>
+        <w:numPr>
+          <w:ilvl w:val="0"/>
+          <w:numId w:val="15"/>
+        </w:numPr>
+        <w:rPr>
+          <w:lang w:val="pt-BR"/>
+        </w:rPr>
+      </w:pPr>
+      <w:r>
+        <w:rPr>
+          <w:lang w:val="pt-BR"/>
+        </w:rPr>
+        <w:t xml:space="preserve">Banco </w:t>
+      </w:r>
+      <w:proofErr w:type="spellStart"/>
+      <w:r>
+        <w:rPr>
+          <w:lang w:val="pt-BR"/>
+        </w:rPr>
+        <w:t>MongoDB</w:t>
+      </w:r>
+      <w:proofErr w:type="spellEnd"/>
+      <w:r>
+        <w:rPr>
+          <w:lang w:val="pt-BR"/>
+        </w:rPr>
+        <w:t xml:space="preserve"> -&gt; Sem mapeamento externo (Exposta apenas internamente na porta 27017). Status: Bloqueada para a internet. Garante a segurança do histórico de conversas e chats.</w:t>
+      </w:r>
+    </w:p>
+    <w:p>
+      <w:pPr>
+        <w:pStyle w:val="Commarcadores"/>
+        <w:rPr>
+          <w:lang w:val="pt-BR"/>
+        </w:rPr>
+      </w:pPr>
+      <w:r>
+        <w:rPr>
+          <w:lang w:val="pt-BR"/>
+        </w:rPr>
+        <w:t xml:space="preserve">Nota para Infraestrutura Avançada: Se houver uma diretriz rígida de segurança que exija que APENAS a porta do </w:t>
+      </w:r>
+      <w:proofErr w:type="spellStart"/>
+      <w:r>
+        <w:rPr>
+          <w:lang w:val="pt-BR"/>
+        </w:rPr>
+        <w:t>Frontend</w:t>
+      </w:r>
+      <w:proofErr w:type="spellEnd"/>
+      <w:r>
+        <w:rPr>
+          <w:lang w:val="pt-BR"/>
+        </w:rPr>
+        <w:t xml:space="preserve"> (5173) seja exposta para o mundo exterior, deverá ser configurado um Proxy Reverso (como </w:t>
+      </w:r>
+      <w:proofErr w:type="spellStart"/>
+      <w:r>
+        <w:rPr>
+          <w:lang w:val="pt-BR"/>
+        </w:rPr>
+        <w:t>Nginx</w:t>
+      </w:r>
+      <w:proofErr w:type="spellEnd"/>
+      <w:r>
+        <w:rPr>
+          <w:lang w:val="pt-BR"/>
+        </w:rPr>
+        <w:t xml:space="preserve">) no servidor para rotear as chamadas do </w:t>
+      </w:r>
+      <w:proofErr w:type="spellStart"/>
+      <w:r>
+        <w:rPr>
+          <w:lang w:val="pt-BR"/>
+        </w:rPr>
+        <w:t>Backend</w:t>
+      </w:r>
+      <w:proofErr w:type="spellEnd"/>
+      <w:r>
+        <w:rPr>
+          <w:lang w:val="pt-BR"/>
+        </w:rPr>
+        <w:t xml:space="preserve"> internamente.</w:t>
+      </w:r>
+    </w:p>
+    <w:p>
+      <w:pPr>
+        <w:pStyle w:val="Commarcadores"/>
+        <w:numPr>
+          <w:ilvl w:val="0"/>
+          <w:numId w:val="0"/>
+        </w:numPr>
+      </w:pPr>
+    </w:p>
+    <w:p>
+      <w:pPr>
         <w:pStyle w:val="Ttulo2"/>
       </w:pPr>
       <w:r>
-        <w:t xml:space="preserve">2. </w:t>
+        <w:t>3</w:t>
+      </w:r>
+      <w:r>
+        <w:t xml:space="preserve">. </w:t>
       </w:r>
       <w:proofErr w:type="spellStart"/>
       <w:r>
@@ -486,7 +944,6 @@
         <w:rPr>
           <w:rFonts w:hAnsi="Symbol"/>
         </w:rPr>
-        <w:lastRenderedPageBreak/>
         <w:t></w:t>
       </w:r>
       <w:r>
@@ -583,6 +1040,11 @@
       </w:r>
     </w:p>
     <w:p>
+      <w:pPr>
+        <w:rPr>
+          <w:lang w:val="pt-BR"/>
+        </w:rPr>
+      </w:pPr>
       <w:r>
         <w:t xml:space="preserve">O </w:t>
       </w:r>
@@ -656,7 +1118,7 @@
       </w:r>
       <w:proofErr w:type="spellEnd"/>
       <w:r>
-        <w:t xml:space="preserve"> agora </w:t>
+        <w:t xml:space="preserve"> (PostgreSQL) </w:t>
       </w:r>
       <w:proofErr w:type="spellStart"/>
       <w:r>
@@ -664,8 +1126,118 @@
       </w:r>
       <w:proofErr w:type="spellEnd"/>
       <w:r>
+        <w:t xml:space="preserve"> a </w:t>
+      </w:r>
+      <w:proofErr w:type="spellStart"/>
+      <w:r>
+        <w:t>modelagem</w:t>
+      </w:r>
+      <w:proofErr w:type="spellEnd"/>
+      <w:r>
+        <w:t xml:space="preserve"> de </w:t>
+      </w:r>
+      <w:proofErr w:type="spellStart"/>
+      <w:r>
+        <w:t>utilizadores</w:t>
+      </w:r>
+      <w:proofErr w:type="spellEnd"/>
+      <w:r>
+        <w:t xml:space="preserve">, </w:t>
+      </w:r>
+      <w:proofErr w:type="spellStart"/>
+      <w:r>
+        <w:t>categorias</w:t>
+      </w:r>
+      <w:proofErr w:type="spellEnd"/>
+      <w:r>
+        <w:t xml:space="preserve">, </w:t>
+      </w:r>
+      <w:proofErr w:type="spellStart"/>
+      <w:r>
+        <w:t>itens</w:t>
+      </w:r>
+      <w:proofErr w:type="spellEnd"/>
+      <w:r>
         <w:t xml:space="preserve"> </w:t>
       </w:r>
+      <w:proofErr w:type="spellStart"/>
+      <w:r>
+        <w:t>cadastrados</w:t>
+      </w:r>
+      <w:proofErr w:type="spellEnd"/>
+      <w:r>
+        <w:t xml:space="preserve"> e o histórico de </w:t>
+      </w:r>
+      <w:proofErr w:type="spellStart"/>
+      <w:r>
+        <w:t>estados</w:t>
+      </w:r>
+      <w:proofErr w:type="spellEnd"/>
+      <w:r>
+        <w:t xml:space="preserve"> dos matches</w:t>
+      </w:r>
+      <w:r>
+        <w:t xml:space="preserve">. </w:t>
+      </w:r>
+      <w:r>
+        <w:t xml:space="preserve">Para </w:t>
+      </w:r>
+      <w:proofErr w:type="spellStart"/>
+      <w:r>
+        <w:t>cumprir</w:t>
+      </w:r>
+      <w:proofErr w:type="spellEnd"/>
+      <w:r>
+        <w:t xml:space="preserve"> </w:t>
+      </w:r>
+      <w:proofErr w:type="spellStart"/>
+      <w:r>
+        <w:t>os</w:t>
+      </w:r>
+      <w:proofErr w:type="spellEnd"/>
+      <w:r>
+        <w:t xml:space="preserve"> </w:t>
+      </w:r>
+      <w:proofErr w:type="spellStart"/>
+      <w:r>
+        <w:t>novos</w:t>
+      </w:r>
+      <w:proofErr w:type="spellEnd"/>
+      <w:r>
+        <w:t xml:space="preserve"> </w:t>
+      </w:r>
+      <w:proofErr w:type="spellStart"/>
+      <w:r>
+        <w:t>requisitos</w:t>
+      </w:r>
+      <w:proofErr w:type="spellEnd"/>
+      <w:r>
+        <w:t xml:space="preserve"> de </w:t>
+      </w:r>
+      <w:proofErr w:type="spellStart"/>
+      <w:r>
+        <w:t>segurança</w:t>
+      </w:r>
+      <w:proofErr w:type="spellEnd"/>
+      <w:r>
+        <w:t xml:space="preserve">, </w:t>
+      </w:r>
+      <w:proofErr w:type="spellStart"/>
+      <w:r>
+        <w:t>foi</w:t>
+      </w:r>
+      <w:proofErr w:type="spellEnd"/>
+      <w:r>
+        <w:t xml:space="preserve"> </w:t>
+      </w:r>
+      <w:proofErr w:type="spellStart"/>
+      <w:r>
+        <w:t>integrada</w:t>
+      </w:r>
+      <w:proofErr w:type="spellEnd"/>
+      <w:r>
+        <w:t xml:space="preserve"> </w:t>
+      </w:r>
       <w:proofErr w:type="gramStart"/>
       <w:r>
         <w:t>a</w:t>
@@ -680,173 +1252,184 @@
       </w:r>
       <w:proofErr w:type="spellEnd"/>
       <w:r>
+        <w:t xml:space="preserve"> "</w:t>
+      </w:r>
+      <w:proofErr w:type="spellStart"/>
+      <w:r>
+        <w:t>password_reset_token</w:t>
+      </w:r>
+      <w:proofErr w:type="spellEnd"/>
+      <w:r>
+        <w:t xml:space="preserve">", </w:t>
+      </w:r>
+      <w:proofErr w:type="spellStart"/>
+      <w:r>
+        <w:t>responsável</w:t>
+      </w:r>
+      <w:proofErr w:type="spellEnd"/>
+      <w:r>
+        <w:t xml:space="preserve"> </w:t>
+      </w:r>
+      <w:proofErr w:type="spellStart"/>
+      <w:r>
+        <w:t>por</w:t>
+      </w:r>
+      <w:proofErr w:type="spellEnd"/>
+      <w:r>
+        <w:t xml:space="preserve"> </w:t>
+      </w:r>
+      <w:proofErr w:type="spellStart"/>
+      <w:r>
+        <w:t>gerir</w:t>
+      </w:r>
+      <w:proofErr w:type="spellEnd"/>
+      <w:r>
+        <w:t xml:space="preserve"> as </w:t>
+      </w:r>
+      <w:proofErr w:type="spellStart"/>
+      <w:r>
+        <w:t>requisições</w:t>
+      </w:r>
+      <w:proofErr w:type="spellEnd"/>
+      <w:r>
+        <w:t xml:space="preserve"> </w:t>
+      </w:r>
+      <w:proofErr w:type="spellStart"/>
+      <w:r>
+        <w:t>ativas</w:t>
+      </w:r>
+      <w:proofErr w:type="spellEnd"/>
+      <w:r>
         <w:t xml:space="preserve"> de </w:t>
       </w:r>
       <w:proofErr w:type="spellStart"/>
       <w:r>
-        <w:t>segurança</w:t>
+        <w:t>recuperação</w:t>
       </w:r>
       <w:proofErr w:type="spellEnd"/>
       <w:r>
+        <w:t xml:space="preserve"> de </w:t>
+      </w:r>
+      <w:proofErr w:type="spellStart"/>
+      <w:r>
+        <w:t>acessos</w:t>
+      </w:r>
+      <w:proofErr w:type="spellEnd"/>
+      <w:r>
+        <w:t xml:space="preserve"> de forma </w:t>
+      </w:r>
+      <w:proofErr w:type="spellStart"/>
+      <w:r>
+        <w:t>temporária</w:t>
+      </w:r>
+      <w:proofErr w:type="spellEnd"/>
+      <w:r>
+        <w:t xml:space="preserve"> e </w:t>
+      </w:r>
+      <w:proofErr w:type="spellStart"/>
+      <w:r>
+        <w:t>segura</w:t>
+      </w:r>
+      <w:proofErr w:type="spellEnd"/>
+      <w:r>
+        <w:t xml:space="preserve">. Toda a </w:t>
+      </w:r>
+      <w:proofErr w:type="spellStart"/>
+      <w:r>
+        <w:t>estrutura</w:t>
+      </w:r>
+      <w:proofErr w:type="spellEnd"/>
+      <w:r>
+        <w:t xml:space="preserve"> de </w:t>
+      </w:r>
+      <w:proofErr w:type="spellStart"/>
+      <w:r>
+        <w:t>conversação</w:t>
+      </w:r>
+      <w:proofErr w:type="spellEnd"/>
+      <w:r>
         <w:t xml:space="preserve"> </w:t>
       </w:r>
       <w:proofErr w:type="spellStart"/>
       <w:r>
-        <w:t>password_reset_token</w:t>
+        <w:t>em</w:t>
       </w:r>
       <w:proofErr w:type="spellEnd"/>
       <w:r>
+        <w:t xml:space="preserve"> tempo real e </w:t>
+      </w:r>
+      <w:proofErr w:type="spellStart"/>
+      <w:r>
+        <w:t>troca</w:t>
+      </w:r>
+      <w:proofErr w:type="spellEnd"/>
+      <w:r>
+        <w:t xml:space="preserve"> de </w:t>
+      </w:r>
+      <w:proofErr w:type="spellStart"/>
+      <w:r>
+        <w:t>mídias</w:t>
+      </w:r>
+      <w:proofErr w:type="spellEnd"/>
+      <w:r>
+        <w:t xml:space="preserve"> (</w:t>
+      </w:r>
+      <w:proofErr w:type="spellStart"/>
+      <w:r>
+        <w:t>conteúdo</w:t>
+      </w:r>
+      <w:proofErr w:type="spellEnd"/>
+      <w:r>
+        <w:t xml:space="preserve"> das </w:t>
+      </w:r>
+      <w:proofErr w:type="spellStart"/>
+      <w:r>
+        <w:t>mensagens</w:t>
+      </w:r>
+      <w:proofErr w:type="spellEnd"/>
+      <w:r>
+        <w:t xml:space="preserve">) é </w:t>
+      </w:r>
+      <w:proofErr w:type="spellStart"/>
+      <w:r>
+        <w:t>delegada</w:t>
+      </w:r>
+      <w:proofErr w:type="spellEnd"/>
+      <w:r>
         <w:t xml:space="preserve"> </w:t>
       </w:r>
       <w:proofErr w:type="spellStart"/>
       <w:r>
-        <w:t>responsável</w:t>
+        <w:t>integralmente</w:t>
       </w:r>
       <w:proofErr w:type="spellEnd"/>
       <w:r>
+        <w:t xml:space="preserve"> à </w:t>
+      </w:r>
+      <w:proofErr w:type="spellStart"/>
+      <w:r>
+        <w:t>estrutura</w:t>
+      </w:r>
+      <w:proofErr w:type="spellEnd"/>
+      <w:r>
+        <w:t xml:space="preserve"> de </w:t>
+      </w:r>
+      <w:proofErr w:type="spellStart"/>
+      <w:r>
+        <w:t>coleções</w:t>
+      </w:r>
+      <w:proofErr w:type="spellEnd"/>
+      <w:r>
         <w:t xml:space="preserve"> </w:t>
       </w:r>
       <w:proofErr w:type="spellStart"/>
       <w:r>
-        <w:t>por</w:t>
+        <w:t>não-relacionais</w:t>
       </w:r>
       <w:proofErr w:type="spellEnd"/>
       <w:r>
-        <w:t xml:space="preserve"> </w:t>
-      </w:r>
-      <w:proofErr w:type="spellStart"/>
-      <w:r>
-        <w:t>gerir</w:t>
-      </w:r>
-      <w:proofErr w:type="spellEnd"/>
-      <w:r>
-        <w:t xml:space="preserve"> as </w:t>
-      </w:r>
-      <w:proofErr w:type="spellStart"/>
-      <w:r>
-        <w:t>requisições</w:t>
-      </w:r>
-      <w:proofErr w:type="spellEnd"/>
-      <w:r>
-        <w:t xml:space="preserve"> </w:t>
-      </w:r>
-      <w:proofErr w:type="spellStart"/>
-      <w:r>
-        <w:t>ativas</w:t>
-      </w:r>
-      <w:proofErr w:type="spellEnd"/>
-      <w:r>
-        <w:t xml:space="preserve"> de </w:t>
-      </w:r>
-      <w:proofErr w:type="spellStart"/>
-      <w:r>
-        <w:t>recuperação</w:t>
-      </w:r>
-      <w:proofErr w:type="spellEnd"/>
-      <w:r>
-        <w:t xml:space="preserve"> de </w:t>
-      </w:r>
-      <w:proofErr w:type="spellStart"/>
-      <w:r>
-        <w:t>senhas</w:t>
-      </w:r>
-      <w:proofErr w:type="spellEnd"/>
-      <w:r>
-        <w:t xml:space="preserve"> dos </w:t>
-      </w:r>
-      <w:proofErr w:type="spellStart"/>
-      <w:r>
-        <w:t>usuários</w:t>
-      </w:r>
-      <w:proofErr w:type="spellEnd"/>
-      <w:r>
-        <w:t xml:space="preserve">. </w:t>
-      </w:r>
-      <w:proofErr w:type="spellStart"/>
-      <w:r>
-        <w:t>Os</w:t>
-      </w:r>
-      <w:proofErr w:type="spellEnd"/>
-      <w:r>
-        <w:t xml:space="preserve"> chats e </w:t>
-      </w:r>
-      <w:proofErr w:type="spellStart"/>
-      <w:r>
-        <w:t>mídias</w:t>
-      </w:r>
-      <w:proofErr w:type="spellEnd"/>
-      <w:r>
-        <w:t xml:space="preserve"> (</w:t>
-      </w:r>
-      <w:proofErr w:type="spellStart"/>
-      <w:r>
-        <w:t>conteúdo</w:t>
-      </w:r>
-      <w:proofErr w:type="spellEnd"/>
-      <w:r>
-        <w:t xml:space="preserve"> das </w:t>
-      </w:r>
-      <w:proofErr w:type="spellStart"/>
-      <w:r>
-        <w:t>mensagens</w:t>
-      </w:r>
-      <w:proofErr w:type="spellEnd"/>
-      <w:r>
-        <w:t xml:space="preserve">) </w:t>
-      </w:r>
-      <w:proofErr w:type="spellStart"/>
-      <w:r>
-        <w:t>são</w:t>
-      </w:r>
-      <w:proofErr w:type="spellEnd"/>
-      <w:r>
-        <w:t xml:space="preserve"> </w:t>
-      </w:r>
-      <w:proofErr w:type="spellStart"/>
-      <w:r>
-        <w:t>delegados</w:t>
-      </w:r>
-      <w:proofErr w:type="spellEnd"/>
-      <w:r>
-        <w:t xml:space="preserve"> </w:t>
-      </w:r>
-      <w:proofErr w:type="spellStart"/>
-      <w:r>
-        <w:t>integralmente</w:t>
-      </w:r>
-      <w:proofErr w:type="spellEnd"/>
-      <w:r>
-        <w:t xml:space="preserve"> à </w:t>
-      </w:r>
-      <w:proofErr w:type="spellStart"/>
-      <w:r>
-        <w:t>estrutura</w:t>
-      </w:r>
-      <w:proofErr w:type="spellEnd"/>
-      <w:r>
-        <w:t xml:space="preserve"> de </w:t>
-      </w:r>
-      <w:proofErr w:type="spellStart"/>
-      <w:r>
-        <w:t>coleções</w:t>
-      </w:r>
-      <w:proofErr w:type="spellEnd"/>
-      <w:r>
-        <w:t xml:space="preserve"> do</w:t>
-      </w:r>
-      <w:r>
-        <w:t xml:space="preserve"> </w:t>
-      </w:r>
-      <w:r>
-        <w:t>MongoDB.</w:t>
-      </w:r>
-    </w:p>
-    <w:p>
-      <w:pPr>
-        <w:rPr>
-          <w:lang w:val="pt-BR"/>
-        </w:rPr>
-      </w:pPr>
+        <w:t xml:space="preserve"> do MongoDB.</w:t>
+      </w:r>
       <w:r>
         <w:rPr>
           <w:noProof/>
@@ -1174,639 +1757,1107 @@
     </w:p>
     <w:p>
       <w:pPr>
-        <w:pStyle w:val="Ttulo3"/>
-      </w:pPr>
-      <w:r>
-        <w:t>Passos para Execução</w:t>
+        <w:rPr>
+          <w:rFonts w:asciiTheme="majorHAnsi" w:eastAsiaTheme="majorEastAsia" w:hAnsiTheme="majorHAnsi" w:cstheme="majorBidi"/>
+          <w:color w:val="000000" w:themeColor="text1"/>
+          <w:lang w:val="pt-BR"/>
+        </w:rPr>
+      </w:pPr>
+      <w:r>
+        <w:rPr>
+          <w:rFonts w:asciiTheme="majorHAnsi" w:eastAsiaTheme="majorEastAsia" w:hAnsiTheme="majorHAnsi" w:cstheme="majorBidi"/>
+          <w:color w:val="000000" w:themeColor="text1"/>
+          <w:lang w:val="pt-BR"/>
+        </w:rPr>
+        <w:t xml:space="preserve">Na raiz do projeto deve ser criado um arquivo de configuração de ambiente chamado </w:t>
+      </w:r>
+      <w:proofErr w:type="gramStart"/>
+      <w:r>
+        <w:rPr>
+          <w:rFonts w:asciiTheme="majorHAnsi" w:eastAsiaTheme="majorEastAsia" w:hAnsiTheme="majorHAnsi" w:cstheme="majorBidi"/>
+          <w:color w:val="000000" w:themeColor="text1"/>
+          <w:lang w:val="pt-BR"/>
+        </w:rPr>
+        <w:t>".</w:t>
+      </w:r>
+      <w:proofErr w:type="spellStart"/>
+      <w:r>
+        <w:rPr>
+          <w:rFonts w:asciiTheme="majorHAnsi" w:eastAsiaTheme="majorEastAsia" w:hAnsiTheme="majorHAnsi" w:cstheme="majorBidi"/>
+          <w:color w:val="000000" w:themeColor="text1"/>
+          <w:lang w:val="pt-BR"/>
+        </w:rPr>
+        <w:t>env</w:t>
+      </w:r>
+      <w:proofErr w:type="spellEnd"/>
+      <w:proofErr w:type="gramEnd"/>
+      <w:r>
+        <w:rPr>
+          <w:rFonts w:asciiTheme="majorHAnsi" w:eastAsiaTheme="majorEastAsia" w:hAnsiTheme="majorHAnsi" w:cstheme="majorBidi"/>
+          <w:color w:val="000000" w:themeColor="text1"/>
+          <w:lang w:val="pt-BR"/>
+        </w:rPr>
+        <w:t xml:space="preserve">", utilizando como base o arquivo </w:t>
+      </w:r>
+      <w:proofErr w:type="spellStart"/>
+      <w:r>
+        <w:rPr>
+          <w:rFonts w:asciiTheme="majorHAnsi" w:eastAsiaTheme="majorEastAsia" w:hAnsiTheme="majorHAnsi" w:cstheme="majorBidi"/>
+          <w:color w:val="000000" w:themeColor="text1"/>
+          <w:lang w:val="pt-BR"/>
+        </w:rPr>
+        <w:t>template</w:t>
+      </w:r>
+      <w:proofErr w:type="spellEnd"/>
+      <w:r>
+        <w:rPr>
+          <w:rFonts w:asciiTheme="majorHAnsi" w:eastAsiaTheme="majorEastAsia" w:hAnsiTheme="majorHAnsi" w:cstheme="majorBidi"/>
+          <w:color w:val="000000" w:themeColor="text1"/>
+          <w:lang w:val="pt-BR"/>
+        </w:rPr>
+        <w:t xml:space="preserve"> </w:t>
+      </w:r>
+      <w:proofErr w:type="gramStart"/>
+      <w:r>
+        <w:rPr>
+          <w:rFonts w:asciiTheme="majorHAnsi" w:eastAsiaTheme="majorEastAsia" w:hAnsiTheme="majorHAnsi" w:cstheme="majorBidi"/>
+          <w:color w:val="000000" w:themeColor="text1"/>
+          <w:lang w:val="pt-BR"/>
+        </w:rPr>
+        <w:t>".</w:t>
+      </w:r>
+      <w:proofErr w:type="spellStart"/>
+      <w:r>
+        <w:rPr>
+          <w:rFonts w:asciiTheme="majorHAnsi" w:eastAsiaTheme="majorEastAsia" w:hAnsiTheme="majorHAnsi" w:cstheme="majorBidi"/>
+          <w:color w:val="000000" w:themeColor="text1"/>
+          <w:lang w:val="pt-BR"/>
+        </w:rPr>
+        <w:t>env</w:t>
+      </w:r>
+      <w:proofErr w:type="gramEnd"/>
+      <w:r>
+        <w:rPr>
+          <w:rFonts w:asciiTheme="majorHAnsi" w:eastAsiaTheme="majorEastAsia" w:hAnsiTheme="majorHAnsi" w:cstheme="majorBidi"/>
+          <w:color w:val="000000" w:themeColor="text1"/>
+          <w:lang w:val="pt-BR"/>
+        </w:rPr>
+        <w:t>.example</w:t>
+      </w:r>
+      <w:proofErr w:type="spellEnd"/>
+      <w:r>
+        <w:rPr>
+          <w:rFonts w:asciiTheme="majorHAnsi" w:eastAsiaTheme="majorEastAsia" w:hAnsiTheme="majorHAnsi" w:cstheme="majorBidi"/>
+          <w:color w:val="000000" w:themeColor="text1"/>
+          <w:lang w:val="pt-BR"/>
+        </w:rPr>
+        <w:t>" fornecido no repositório. Três variáveis possuem caráter crítico de segurança e devem ser geradas de forma isolada:</w:t>
       </w:r>
     </w:p>
     <w:p>
-      <w:r>
-        <w:t xml:space="preserve">I. </w:t>
+      <w:pPr>
+        <w:numPr>
+          <w:ilvl w:val="0"/>
+          <w:numId w:val="16"/>
+        </w:numPr>
+        <w:rPr>
+          <w:rFonts w:asciiTheme="majorHAnsi" w:eastAsiaTheme="majorEastAsia" w:hAnsiTheme="majorHAnsi" w:cstheme="majorBidi"/>
+          <w:color w:val="000000" w:themeColor="text1"/>
+          <w:lang w:val="pt-BR"/>
+        </w:rPr>
+      </w:pPr>
+      <w:r>
+        <w:rPr>
+          <w:rFonts w:asciiTheme="majorHAnsi" w:eastAsiaTheme="majorEastAsia" w:hAnsiTheme="majorHAnsi" w:cstheme="majorBidi"/>
+          <w:color w:val="000000" w:themeColor="text1"/>
+          <w:lang w:val="pt-BR"/>
+        </w:rPr>
+        <w:t xml:space="preserve">SECRET: </w:t>
       </w:r>
       <w:proofErr w:type="spellStart"/>
       <w:r>
-        <w:t>Clonar</w:t>
+        <w:rPr>
+          <w:rFonts w:asciiTheme="majorHAnsi" w:eastAsiaTheme="majorEastAsia" w:hAnsiTheme="majorHAnsi" w:cstheme="majorBidi"/>
+          <w:color w:val="000000" w:themeColor="text1"/>
+          <w:lang w:val="pt-BR"/>
+        </w:rPr>
+        <w:t>String</w:t>
       </w:r>
       <w:proofErr w:type="spellEnd"/>
       <w:r>
-        <w:t xml:space="preserve"> o </w:t>
-      </w:r>
-      <w:proofErr w:type="spellStart"/>
-      <w:r>
-        <w:t>repositório</w:t>
-      </w:r>
-      <w:proofErr w:type="spellEnd"/>
-      <w:r>
-        <w:t>:</w:t>
-      </w:r>
-      <w:r>
-        <w:t xml:space="preserve"> </w:t>
+        <w:rPr>
+          <w:rFonts w:asciiTheme="majorHAnsi" w:eastAsiaTheme="majorEastAsia" w:hAnsiTheme="majorHAnsi" w:cstheme="majorBidi"/>
+          <w:color w:val="000000" w:themeColor="text1"/>
+          <w:lang w:val="pt-BR"/>
+        </w:rPr>
+        <w:t xml:space="preserve"> de assinatura forte e aleatória utilizada para a criptografia e validação dos tokens JWT no Spring Security.</w:t>
       </w:r>
     </w:p>
     <w:p>
       <w:pPr>
-        <w:pStyle w:val="CitaoIntensa"/>
-      </w:pPr>
-      <w:r>
-        <w:t xml:space="preserve">git clone </w:t>
+        <w:numPr>
+          <w:ilvl w:val="0"/>
+          <w:numId w:val="16"/>
+        </w:numPr>
+        <w:rPr>
+          <w:rFonts w:asciiTheme="majorHAnsi" w:eastAsiaTheme="majorEastAsia" w:hAnsiTheme="majorHAnsi" w:cstheme="majorBidi"/>
+          <w:color w:val="000000" w:themeColor="text1"/>
+          <w:lang w:val="pt-BR"/>
+        </w:rPr>
+      </w:pPr>
+      <w:r>
+        <w:rPr>
+          <w:rFonts w:asciiTheme="majorHAnsi" w:eastAsiaTheme="majorEastAsia" w:hAnsiTheme="majorHAnsi" w:cstheme="majorBidi"/>
+          <w:color w:val="000000" w:themeColor="text1"/>
+          <w:lang w:val="pt-BR"/>
+        </w:rPr>
+        <w:lastRenderedPageBreak/>
+        <w:t xml:space="preserve">MATCH_API_KEY: Chave de validação restrita compartilhada que impede que requisições externas chamem a API de inteligência artificial em Python diretamente sem passar pelo filtro do </w:t>
       </w:r>
       <w:proofErr w:type="spellStart"/>
+      <w:r>
+        <w:rPr>
+          <w:rFonts w:asciiTheme="majorHAnsi" w:eastAsiaTheme="majorEastAsia" w:hAnsiTheme="majorHAnsi" w:cstheme="majorBidi"/>
+          <w:color w:val="000000" w:themeColor="text1"/>
+          <w:lang w:val="pt-BR"/>
+        </w:rPr>
+        <w:t>Backend</w:t>
+      </w:r>
+      <w:proofErr w:type="spellEnd"/>
+      <w:r>
+        <w:rPr>
+          <w:rFonts w:asciiTheme="majorHAnsi" w:eastAsiaTheme="majorEastAsia" w:hAnsiTheme="majorHAnsi" w:cstheme="majorBidi"/>
+          <w:color w:val="000000" w:themeColor="text1"/>
+          <w:lang w:val="pt-BR"/>
+        </w:rPr>
+        <w:t xml:space="preserve"> Java.</w:t>
+      </w:r>
+    </w:p>
+    <w:p>
+      <w:pPr>
+        <w:numPr>
+          <w:ilvl w:val="0"/>
+          <w:numId w:val="16"/>
+        </w:numPr>
+        <w:rPr>
+          <w:rFonts w:asciiTheme="majorHAnsi" w:eastAsiaTheme="majorEastAsia" w:hAnsiTheme="majorHAnsi" w:cstheme="majorBidi"/>
+          <w:color w:val="000000" w:themeColor="text1"/>
+          <w:lang w:val="pt-BR"/>
+        </w:rPr>
+      </w:pPr>
+      <w:r>
+        <w:rPr>
+          <w:rFonts w:asciiTheme="majorHAnsi" w:eastAsiaTheme="majorEastAsia" w:hAnsiTheme="majorHAnsi" w:cstheme="majorBidi"/>
+          <w:color w:val="000000" w:themeColor="text1"/>
+          <w:lang w:val="pt-BR"/>
+        </w:rPr>
+        <w:t>MAIL_PASSWORD: Senha de autenticação do protocolo SMTP necessária para o envio automático de e-mails de recuperação de conta.</w:t>
+      </w:r>
+    </w:p>
+    <w:p>
+      <w:pPr>
+        <w:rPr>
+          <w:rFonts w:asciiTheme="majorHAnsi" w:eastAsiaTheme="majorEastAsia" w:hAnsiTheme="majorHAnsi" w:cstheme="majorBidi"/>
+          <w:color w:val="000000" w:themeColor="text1"/>
+          <w:lang w:val="pt-BR"/>
+        </w:rPr>
+      </w:pPr>
+      <w:r>
+        <w:rPr>
+          <w:rFonts w:asciiTheme="majorHAnsi" w:eastAsiaTheme="majorEastAsia" w:hAnsiTheme="majorHAnsi" w:cstheme="majorBidi"/>
+          <w:color w:val="000000" w:themeColor="text1"/>
+          <w:lang w:val="pt-BR"/>
+        </w:rPr>
+        <w:t>Instruções para Obter o "MAIL_PASSWORD" do Google (Senha de App):</w:t>
+      </w:r>
+    </w:p>
+    <w:p>
+      <w:pPr>
+        <w:rPr>
+          <w:rFonts w:asciiTheme="majorHAnsi" w:eastAsiaTheme="majorEastAsia" w:hAnsiTheme="majorHAnsi" w:cstheme="majorBidi"/>
+          <w:color w:val="000000" w:themeColor="text1"/>
+          <w:lang w:val="pt-BR"/>
+        </w:rPr>
+      </w:pPr>
+      <w:r>
+        <w:rPr>
+          <w:rFonts w:asciiTheme="majorHAnsi" w:eastAsiaTheme="majorEastAsia" w:hAnsiTheme="majorHAnsi" w:cstheme="majorBidi"/>
+          <w:color w:val="000000" w:themeColor="text1"/>
+          <w:lang w:val="pt-BR"/>
+        </w:rPr>
+        <w:t>Por regras estritas de segurança da Google, não é permitido expor a senha real da sua conta de e-mail em ficheiros de configuração. Deve-se gerar uma Senha de App de 16 dígitos seguindo o procedimento abaixo:</w:t>
+      </w:r>
+    </w:p>
+    <w:p>
+      <w:pPr>
+        <w:numPr>
+          <w:ilvl w:val="0"/>
+          <w:numId w:val="17"/>
+        </w:numPr>
+        <w:rPr>
+          <w:rFonts w:asciiTheme="majorHAnsi" w:eastAsiaTheme="majorEastAsia" w:hAnsiTheme="majorHAnsi" w:cstheme="majorBidi"/>
+          <w:color w:val="000000" w:themeColor="text1"/>
+          <w:lang w:val="pt-BR"/>
+        </w:rPr>
+      </w:pPr>
+      <w:r>
+        <w:rPr>
+          <w:rFonts w:asciiTheme="majorHAnsi" w:eastAsiaTheme="majorEastAsia" w:hAnsiTheme="majorHAnsi" w:cstheme="majorBidi"/>
+          <w:color w:val="000000" w:themeColor="text1"/>
+          <w:lang w:val="pt-BR"/>
+        </w:rPr>
+        <w:t>Acesse o painel da Conta do Google (myaccount.google.com) que gerenciará os disparos.</w:t>
+      </w:r>
+    </w:p>
+    <w:p>
+      <w:pPr>
+        <w:numPr>
+          <w:ilvl w:val="0"/>
+          <w:numId w:val="17"/>
+        </w:numPr>
+        <w:rPr>
+          <w:rFonts w:asciiTheme="majorHAnsi" w:eastAsiaTheme="majorEastAsia" w:hAnsiTheme="majorHAnsi" w:cstheme="majorBidi"/>
+          <w:color w:val="000000" w:themeColor="text1"/>
+          <w:lang w:val="pt-BR"/>
+        </w:rPr>
+      </w:pPr>
+      <w:r>
+        <w:rPr>
+          <w:rFonts w:asciiTheme="majorHAnsi" w:eastAsiaTheme="majorEastAsia" w:hAnsiTheme="majorHAnsi" w:cstheme="majorBidi"/>
+          <w:color w:val="000000" w:themeColor="text1"/>
+          <w:lang w:val="pt-BR"/>
+        </w:rPr>
+        <w:t>Navegue até a aba "Segurança".</w:t>
+      </w:r>
+    </w:p>
+    <w:p>
+      <w:pPr>
+        <w:numPr>
+          <w:ilvl w:val="0"/>
+          <w:numId w:val="17"/>
+        </w:numPr>
+        <w:rPr>
+          <w:rFonts w:asciiTheme="majorHAnsi" w:eastAsiaTheme="majorEastAsia" w:hAnsiTheme="majorHAnsi" w:cstheme="majorBidi"/>
+          <w:color w:val="000000" w:themeColor="text1"/>
+          <w:lang w:val="pt-BR"/>
+        </w:rPr>
+      </w:pPr>
+      <w:r>
+        <w:rPr>
+          <w:rFonts w:asciiTheme="majorHAnsi" w:eastAsiaTheme="majorEastAsia" w:hAnsiTheme="majorHAnsi" w:cstheme="majorBidi"/>
+          <w:color w:val="000000" w:themeColor="text1"/>
+          <w:lang w:val="pt-BR"/>
+        </w:rPr>
+        <w:t>Na seção "Como você faz login no Google", certifique-se de que a "Verificação em duas etapas" esteja ATIVADA. Este passo é obrigatório.</w:t>
+      </w:r>
+    </w:p>
+    <w:p>
+      <w:pPr>
+        <w:numPr>
+          <w:ilvl w:val="0"/>
+          <w:numId w:val="17"/>
+        </w:numPr>
+        <w:rPr>
+          <w:rFonts w:asciiTheme="majorHAnsi" w:eastAsiaTheme="majorEastAsia" w:hAnsiTheme="majorHAnsi" w:cstheme="majorBidi"/>
+          <w:color w:val="000000" w:themeColor="text1"/>
+          <w:lang w:val="pt-BR"/>
+        </w:rPr>
+      </w:pPr>
+      <w:r>
+        <w:rPr>
+          <w:rFonts w:asciiTheme="majorHAnsi" w:eastAsiaTheme="majorEastAsia" w:hAnsiTheme="majorHAnsi" w:cstheme="majorBidi"/>
+          <w:color w:val="000000" w:themeColor="text1"/>
+          <w:lang w:val="pt-BR"/>
+        </w:rPr>
+        <w:t>Utilize a barra de pesquisa localizada no topo da página, digite "Senhas de app" e selecione a opção correspondente.</w:t>
+      </w:r>
+    </w:p>
+    <w:p>
+      <w:pPr>
+        <w:numPr>
+          <w:ilvl w:val="0"/>
+          <w:numId w:val="17"/>
+        </w:numPr>
+        <w:rPr>
+          <w:rFonts w:asciiTheme="majorHAnsi" w:eastAsiaTheme="majorEastAsia" w:hAnsiTheme="majorHAnsi" w:cstheme="majorBidi"/>
+          <w:color w:val="000000" w:themeColor="text1"/>
+          <w:lang w:val="pt-BR"/>
+        </w:rPr>
+      </w:pPr>
+      <w:r>
+        <w:rPr>
+          <w:rFonts w:asciiTheme="majorHAnsi" w:eastAsiaTheme="majorEastAsia" w:hAnsiTheme="majorHAnsi" w:cstheme="majorBidi"/>
+          <w:color w:val="000000" w:themeColor="text1"/>
+          <w:lang w:val="pt-BR"/>
+        </w:rPr>
+        <w:t>Digite novamente a senha da sua conta para confirmação de identidade, caso seja solicitado.</w:t>
+      </w:r>
+    </w:p>
+    <w:p>
+      <w:pPr>
+        <w:numPr>
+          <w:ilvl w:val="0"/>
+          <w:numId w:val="17"/>
+        </w:numPr>
+        <w:rPr>
+          <w:rFonts w:asciiTheme="majorHAnsi" w:eastAsiaTheme="majorEastAsia" w:hAnsiTheme="majorHAnsi" w:cstheme="majorBidi"/>
+          <w:color w:val="000000" w:themeColor="text1"/>
+          <w:lang w:val="pt-BR"/>
+        </w:rPr>
+      </w:pPr>
+      <w:r>
+        <w:rPr>
+          <w:rFonts w:asciiTheme="majorHAnsi" w:eastAsiaTheme="majorEastAsia" w:hAnsiTheme="majorHAnsi" w:cstheme="majorBidi"/>
+          <w:color w:val="000000" w:themeColor="text1"/>
+          <w:lang w:val="pt-BR"/>
+        </w:rPr>
+        <w:t>No campo de texto correspondente ao nome do aplicativo, digite uma identificação clara (Exemplo: "Sistema Achados e Perdidos CEFET") e clique em "Criar".</w:t>
+      </w:r>
+    </w:p>
+    <w:p>
+      <w:pPr>
+        <w:numPr>
+          <w:ilvl w:val="0"/>
+          <w:numId w:val="17"/>
+        </w:numPr>
+        <w:rPr>
+          <w:rFonts w:asciiTheme="majorHAnsi" w:eastAsiaTheme="majorEastAsia" w:hAnsiTheme="majorHAnsi" w:cstheme="majorBidi"/>
+          <w:color w:val="000000" w:themeColor="text1"/>
+          <w:lang w:val="pt-BR"/>
+        </w:rPr>
+      </w:pPr>
+      <w:r>
+        <w:rPr>
+          <w:rFonts w:asciiTheme="majorHAnsi" w:eastAsiaTheme="majorEastAsia" w:hAnsiTheme="majorHAnsi" w:cstheme="majorBidi"/>
+          <w:color w:val="000000" w:themeColor="text1"/>
+          <w:lang w:val="pt-BR"/>
+        </w:rPr>
+        <w:t>Uma janela pop-up exibirá um código de 16 letras dentro de um quadrante. Copie este código imediatamente (ele só é exibido esta vez).</w:t>
+      </w:r>
+    </w:p>
+    <w:p>
+      <w:pPr>
+        <w:numPr>
+          <w:ilvl w:val="0"/>
+          <w:numId w:val="17"/>
+        </w:numPr>
+        <w:rPr>
+          <w:rFonts w:asciiTheme="majorHAnsi" w:eastAsiaTheme="majorEastAsia" w:hAnsiTheme="majorHAnsi" w:cstheme="majorBidi"/>
+          <w:color w:val="000000" w:themeColor="text1"/>
+          <w:lang w:val="pt-BR"/>
+        </w:rPr>
+      </w:pPr>
+      <w:r>
+        <w:rPr>
+          <w:rFonts w:asciiTheme="majorHAnsi" w:eastAsiaTheme="majorEastAsia" w:hAnsiTheme="majorHAnsi" w:cstheme="majorBidi"/>
+          <w:color w:val="000000" w:themeColor="text1"/>
+          <w:lang w:val="pt-BR"/>
+        </w:rPr>
+        <w:t xml:space="preserve">No arquivo </w:t>
+      </w:r>
       <w:proofErr w:type="gramStart"/>
       <w:r>
-        <w:t>git@github.com:maceloareas</w:t>
-      </w:r>
-      <w:proofErr w:type="spellEnd"/>
-      <w:r>
-        <w:t>/</w:t>
+        <w:rPr>
+          <w:rFonts w:asciiTheme="majorHAnsi" w:eastAsiaTheme="majorEastAsia" w:hAnsiTheme="majorHAnsi" w:cstheme="majorBidi"/>
+          <w:color w:val="000000" w:themeColor="text1"/>
+          <w:lang w:val="pt-BR"/>
+        </w:rPr>
+        <w:t>".</w:t>
       </w:r>
       <w:proofErr w:type="spellStart"/>
       <w:r>
-        <w:t>AchadosPerdidos.git</w:t>
+        <w:rPr>
+          <w:rFonts w:asciiTheme="majorHAnsi" w:eastAsiaTheme="majorEastAsia" w:hAnsiTheme="majorHAnsi" w:cstheme="majorBidi"/>
+          <w:color w:val="000000" w:themeColor="text1"/>
+          <w:lang w:val="pt-BR"/>
+        </w:rPr>
+        <w:t>env</w:t>
       </w:r>
       <w:proofErr w:type="spellEnd"/>
       <w:proofErr w:type="gramEnd"/>
-    </w:p>
-    <w:p/>
-    <w:p>
-      <w:pPr>
-        <w:spacing w:after="0"/>
-      </w:pPr>
-      <w:r>
-        <w:t xml:space="preserve">II. </w:t>
+      <w:r>
+        <w:rPr>
+          <w:rFonts w:asciiTheme="majorHAnsi" w:eastAsiaTheme="majorEastAsia" w:hAnsiTheme="majorHAnsi" w:cstheme="majorBidi"/>
+          <w:color w:val="000000" w:themeColor="text1"/>
+          <w:lang w:val="pt-BR"/>
+        </w:rPr>
+        <w:t>", remova os espaços em branco gerados pelo Google e cole as 16 letras juntas (Exemplo: MAIL_PASSWORD=</w:t>
       </w:r>
       <w:proofErr w:type="spellStart"/>
       <w:r>
-        <w:t>Criar</w:t>
+        <w:rPr>
+          <w:rFonts w:asciiTheme="majorHAnsi" w:eastAsiaTheme="majorEastAsia" w:hAnsiTheme="majorHAnsi" w:cstheme="majorBidi"/>
+          <w:color w:val="000000" w:themeColor="text1"/>
+          <w:lang w:val="pt-BR"/>
+        </w:rPr>
+        <w:t>abcdefghijklmnop</w:t>
       </w:r>
       <w:proofErr w:type="spellEnd"/>
       <w:r>
-        <w:t xml:space="preserve"> um </w:t>
-      </w:r>
-      <w:proofErr w:type="spellStart"/>
-      <w:proofErr w:type="gramStart"/>
-      <w:r>
-        <w:t>arquivo</w:t>
-      </w:r>
-      <w:proofErr w:type="spellEnd"/>
-      <w:r>
-        <w:t xml:space="preserve"> .env</w:t>
-      </w:r>
-      <w:proofErr w:type="gramEnd"/>
-      <w:r>
-        <w:t xml:space="preserve"> </w:t>
-      </w:r>
-      <w:proofErr w:type="spellStart"/>
-      <w:r>
-        <w:t>na</w:t>
-      </w:r>
-      <w:proofErr w:type="spellEnd"/>
-      <w:r>
-        <w:t xml:space="preserve"> </w:t>
-      </w:r>
-      <w:proofErr w:type="spellStart"/>
-      <w:r>
-        <w:t>raiz</w:t>
-      </w:r>
-      <w:proofErr w:type="spellEnd"/>
-      <w:r>
-        <w:t xml:space="preserve"> do </w:t>
-      </w:r>
-      <w:proofErr w:type="spellStart"/>
-      <w:r>
-        <w:t>projeto</w:t>
-      </w:r>
-      <w:proofErr w:type="spellEnd"/>
-      <w:r>
-        <w:t>.</w:t>
-      </w:r>
-      <w:r>
-        <w:t xml:space="preserve"> </w:t>
-      </w:r>
-      <w:r>
-        <w:t xml:space="preserve">Para </w:t>
-      </w:r>
-      <w:proofErr w:type="spellStart"/>
-      <w:r>
-        <w:t>facilitar</w:t>
-      </w:r>
-      <w:proofErr w:type="spellEnd"/>
-      <w:r>
-        <w:t xml:space="preserve">, utilize o </w:t>
-      </w:r>
-      <w:proofErr w:type="spellStart"/>
-      <w:r>
-        <w:t>arquivo</w:t>
-      </w:r>
-      <w:proofErr w:type="spellEnd"/>
-      <w:r>
-        <w:t xml:space="preserve"> </w:t>
-      </w:r>
-      <w:proofErr w:type="gramStart"/>
-      <w:r>
-        <w:t>base .</w:t>
-      </w:r>
-      <w:proofErr w:type="spellStart"/>
-      <w:r>
-        <w:t>env</w:t>
-      </w:r>
-      <w:proofErr w:type="gramEnd"/>
-      <w:r>
-        <w:t>.example</w:t>
-      </w:r>
-      <w:proofErr w:type="spellEnd"/>
-      <w:r>
-        <w:t xml:space="preserve"> </w:t>
-      </w:r>
-      <w:proofErr w:type="spellStart"/>
-      <w:r>
-        <w:t>fornecido</w:t>
-      </w:r>
-      <w:proofErr w:type="spellEnd"/>
-      <w:r>
-        <w:t xml:space="preserve"> no </w:t>
-      </w:r>
-      <w:proofErr w:type="spellStart"/>
-      <w:r>
-        <w:t>repositório</w:t>
-      </w:r>
-      <w:proofErr w:type="spellEnd"/>
-      <w:r>
-        <w:t xml:space="preserve">. O </w:t>
-      </w:r>
-      <w:proofErr w:type="spellStart"/>
-      <w:r>
-        <w:t>arquivo</w:t>
-      </w:r>
-      <w:proofErr w:type="spellEnd"/>
-      <w:r>
-        <w:t xml:space="preserve"> </w:t>
-      </w:r>
-      <w:proofErr w:type="spellStart"/>
-      <w:r>
-        <w:t>deve</w:t>
-      </w:r>
-      <w:proofErr w:type="spellEnd"/>
-      <w:r>
-        <w:t xml:space="preserve"> </w:t>
-      </w:r>
-      <w:proofErr w:type="spellStart"/>
-      <w:r>
-        <w:t>conter</w:t>
-      </w:r>
-      <w:proofErr w:type="spellEnd"/>
-      <w:r>
-        <w:t xml:space="preserve"> </w:t>
-      </w:r>
-      <w:proofErr w:type="spellStart"/>
-      <w:r>
-        <w:t>definições</w:t>
-      </w:r>
-      <w:proofErr w:type="spellEnd"/>
-      <w:r>
-        <w:t xml:space="preserve"> </w:t>
-      </w:r>
-      <w:proofErr w:type="spellStart"/>
-      <w:r>
-        <w:t>como</w:t>
-      </w:r>
-      <w:proofErr w:type="spellEnd"/>
-      <w:r>
-        <w:t xml:space="preserve"> </w:t>
-      </w:r>
-      <w:proofErr w:type="spellStart"/>
-      <w:r>
-        <w:t>bancos</w:t>
-      </w:r>
-      <w:proofErr w:type="spellEnd"/>
-      <w:r>
-        <w:t xml:space="preserve"> de dados, e as </w:t>
-      </w:r>
-      <w:proofErr w:type="spellStart"/>
-      <w:r>
-        <w:t>seguintes</w:t>
-      </w:r>
-      <w:proofErr w:type="spellEnd"/>
-      <w:r>
-        <w:t xml:space="preserve"> </w:t>
-      </w:r>
-      <w:proofErr w:type="spellStart"/>
-      <w:r>
-        <w:t>variáveis</w:t>
-      </w:r>
-      <w:proofErr w:type="spellEnd"/>
-      <w:r>
-        <w:t xml:space="preserve"> </w:t>
-      </w:r>
-      <w:proofErr w:type="spellStart"/>
-      <w:r>
-        <w:t>críticas</w:t>
-      </w:r>
-      <w:proofErr w:type="spellEnd"/>
-      <w:r>
-        <w:t xml:space="preserve">: </w:t>
+        <w:rPr>
+          <w:rFonts w:asciiTheme="majorHAnsi" w:eastAsiaTheme="majorEastAsia" w:hAnsiTheme="majorHAnsi" w:cstheme="majorBidi"/>
+          <w:color w:val="000000" w:themeColor="text1"/>
+          <w:lang w:val="pt-BR"/>
+        </w:rPr>
+        <w:t>).</w:t>
       </w:r>
     </w:p>
     <w:p>
       <w:pPr>
-        <w:spacing w:after="0"/>
-      </w:pPr>
+        <w:rPr>
+          <w:rFonts w:asciiTheme="majorHAnsi" w:eastAsiaTheme="majorEastAsia" w:hAnsiTheme="majorHAnsi" w:cstheme="majorBidi"/>
+          <w:color w:val="000000" w:themeColor="text1"/>
+          <w:lang w:val="pt-BR"/>
+        </w:rPr>
+      </w:pPr>
+      <w:r>
+        <w:rPr>
+          <w:rFonts w:asciiTheme="majorHAnsi" w:eastAsiaTheme="majorEastAsia" w:hAnsiTheme="majorHAnsi" w:cstheme="majorBidi"/>
+          <w:color w:val="000000" w:themeColor="text1"/>
+          <w:lang w:val="pt-BR"/>
+        </w:rPr>
+        <w:t xml:space="preserve">Passos para Execução e </w:t>
+      </w:r>
+      <w:proofErr w:type="spellStart"/>
+      <w:r>
+        <w:rPr>
+          <w:rFonts w:asciiTheme="majorHAnsi" w:eastAsiaTheme="majorEastAsia" w:hAnsiTheme="majorHAnsi" w:cstheme="majorBidi"/>
+          <w:color w:val="000000" w:themeColor="text1"/>
+          <w:lang w:val="pt-BR"/>
+        </w:rPr>
+        <w:t>Deploy</w:t>
+      </w:r>
+      <w:proofErr w:type="spellEnd"/>
+      <w:r>
+        <w:rPr>
+          <w:rFonts w:asciiTheme="majorHAnsi" w:eastAsiaTheme="majorEastAsia" w:hAnsiTheme="majorHAnsi" w:cstheme="majorBidi"/>
+          <w:color w:val="000000" w:themeColor="text1"/>
+          <w:lang w:val="pt-BR"/>
+        </w:rPr>
+        <w:t xml:space="preserve">: I. Clonar o repositório: </w:t>
+      </w:r>
+      <w:proofErr w:type="spellStart"/>
+      <w:r>
+        <w:rPr>
+          <w:rFonts w:asciiTheme="majorHAnsi" w:eastAsiaTheme="majorEastAsia" w:hAnsiTheme="majorHAnsi" w:cstheme="majorBidi"/>
+          <w:color w:val="000000" w:themeColor="text1"/>
+          <w:lang w:val="pt-BR"/>
+        </w:rPr>
+        <w:t>git</w:t>
+      </w:r>
+      <w:proofErr w:type="spellEnd"/>
+      <w:r>
+        <w:rPr>
+          <w:rFonts w:asciiTheme="majorHAnsi" w:eastAsiaTheme="majorEastAsia" w:hAnsiTheme="majorHAnsi" w:cstheme="majorBidi"/>
+          <w:color w:val="000000" w:themeColor="text1"/>
+          <w:lang w:val="pt-BR"/>
+        </w:rPr>
+        <w:t xml:space="preserve"> clone </w:t>
+      </w:r>
+      <w:proofErr w:type="spellStart"/>
+      <w:r>
+        <w:rPr>
+          <w:rFonts w:asciiTheme="majorHAnsi" w:eastAsiaTheme="majorEastAsia" w:hAnsiTheme="majorHAnsi" w:cstheme="majorBidi"/>
+          <w:b/>
+          <w:bCs/>
+          <w:color w:val="4F81BD" w:themeColor="accent1"/>
+          <w:lang w:val="pt-BR"/>
+        </w:rPr>
+        <w:t>git@github.com:marceloareas</w:t>
+      </w:r>
+      <w:proofErr w:type="spellEnd"/>
+      <w:r>
+        <w:rPr>
+          <w:rFonts w:asciiTheme="majorHAnsi" w:eastAsiaTheme="majorEastAsia" w:hAnsiTheme="majorHAnsi" w:cstheme="majorBidi"/>
+          <w:b/>
+          <w:bCs/>
+          <w:color w:val="4F81BD" w:themeColor="accent1"/>
+          <w:lang w:val="pt-BR"/>
+        </w:rPr>
+        <w:t>/</w:t>
+      </w:r>
+      <w:proofErr w:type="spellStart"/>
+      <w:r>
+        <w:rPr>
+          <w:rFonts w:asciiTheme="majorHAnsi" w:eastAsiaTheme="majorEastAsia" w:hAnsiTheme="majorHAnsi" w:cstheme="majorBidi"/>
+          <w:b/>
+          <w:bCs/>
+          <w:color w:val="4F81BD" w:themeColor="accent1"/>
+          <w:lang w:val="pt-BR"/>
+        </w:rPr>
+        <w:t>AchadosPerdidos.git</w:t>
+      </w:r>
+      <w:proofErr w:type="spellEnd"/>
+      <w:r>
+        <w:rPr>
+          <w:rFonts w:asciiTheme="majorHAnsi" w:eastAsiaTheme="majorEastAsia" w:hAnsiTheme="majorHAnsi" w:cstheme="majorBidi"/>
+          <w:color w:val="4F81BD" w:themeColor="accent1"/>
+          <w:lang w:val="pt-BR"/>
+        </w:rPr>
+        <w:t xml:space="preserve"> </w:t>
+      </w:r>
     </w:p>
     <w:p>
       <w:pPr>
-        <w:pStyle w:val="Commarcadores"/>
+        <w:rPr>
+          <w:rFonts w:asciiTheme="majorHAnsi" w:eastAsiaTheme="majorEastAsia" w:hAnsiTheme="majorHAnsi" w:cstheme="majorBidi"/>
+          <w:color w:val="000000" w:themeColor="text1"/>
+          <w:lang w:val="pt-BR"/>
+        </w:rPr>
+      </w:pPr>
+      <w:r>
+        <w:rPr>
+          <w:rFonts w:asciiTheme="majorHAnsi" w:eastAsiaTheme="majorEastAsia" w:hAnsiTheme="majorHAnsi" w:cstheme="majorBidi"/>
+          <w:color w:val="000000" w:themeColor="text1"/>
+          <w:lang w:val="pt-BR"/>
+        </w:rPr>
+        <w:t xml:space="preserve">II. Configurar o arquivo </w:t>
+      </w:r>
+      <w:proofErr w:type="gramStart"/>
+      <w:r>
+        <w:rPr>
+          <w:rFonts w:asciiTheme="majorHAnsi" w:eastAsiaTheme="majorEastAsia" w:hAnsiTheme="majorHAnsi" w:cstheme="majorBidi"/>
+          <w:color w:val="000000" w:themeColor="text1"/>
+          <w:lang w:val="pt-BR"/>
+        </w:rPr>
+        <w:t>".</w:t>
+      </w:r>
+      <w:proofErr w:type="spellStart"/>
+      <w:r>
+        <w:rPr>
+          <w:rFonts w:asciiTheme="majorHAnsi" w:eastAsiaTheme="majorEastAsia" w:hAnsiTheme="majorHAnsi" w:cstheme="majorBidi"/>
+          <w:color w:val="000000" w:themeColor="text1"/>
+          <w:lang w:val="pt-BR"/>
+        </w:rPr>
+        <w:t>env</w:t>
+      </w:r>
+      <w:proofErr w:type="spellEnd"/>
+      <w:proofErr w:type="gramEnd"/>
+      <w:r>
+        <w:rPr>
+          <w:rFonts w:asciiTheme="majorHAnsi" w:eastAsiaTheme="majorEastAsia" w:hAnsiTheme="majorHAnsi" w:cstheme="majorBidi"/>
+          <w:color w:val="000000" w:themeColor="text1"/>
+          <w:lang w:val="pt-BR"/>
+        </w:rPr>
+        <w:t>" na raiz conforme as instruções acima.</w:t>
+      </w:r>
+    </w:p>
+    <w:p>
+      <w:pPr>
+        <w:rPr>
+          <w:rFonts w:asciiTheme="majorHAnsi" w:eastAsiaTheme="majorEastAsia" w:hAnsiTheme="majorHAnsi" w:cstheme="majorBidi"/>
+          <w:color w:val="000000" w:themeColor="text1"/>
+          <w:lang w:val="pt-BR"/>
+        </w:rPr>
+      </w:pPr>
+      <w:r>
+        <w:rPr>
+          <w:rFonts w:asciiTheme="majorHAnsi" w:eastAsiaTheme="majorEastAsia" w:hAnsiTheme="majorHAnsi" w:cstheme="majorBidi"/>
+          <w:color w:val="000000" w:themeColor="text1"/>
+          <w:lang w:val="pt-BR"/>
+        </w:rPr>
+        <w:t xml:space="preserve">III. Subir os containers Docker: </w:t>
+      </w:r>
+      <w:proofErr w:type="spellStart"/>
+      <w:r>
+        <w:rPr>
+          <w:rFonts w:asciiTheme="majorHAnsi" w:eastAsiaTheme="majorEastAsia" w:hAnsiTheme="majorHAnsi" w:cstheme="majorBidi"/>
+          <w:color w:val="000000" w:themeColor="text1"/>
+          <w:lang w:val="pt-BR"/>
+        </w:rPr>
+        <w:t>docker-compose</w:t>
+      </w:r>
+      <w:proofErr w:type="spellEnd"/>
+      <w:r>
+        <w:rPr>
+          <w:rFonts w:asciiTheme="majorHAnsi" w:eastAsiaTheme="majorEastAsia" w:hAnsiTheme="majorHAnsi" w:cstheme="majorBidi"/>
+          <w:color w:val="000000" w:themeColor="text1"/>
+          <w:lang w:val="pt-BR"/>
+        </w:rPr>
+        <w:t xml:space="preserve"> </w:t>
+      </w:r>
+      <w:proofErr w:type="spellStart"/>
+      <w:r>
+        <w:rPr>
+          <w:rFonts w:asciiTheme="majorHAnsi" w:eastAsiaTheme="majorEastAsia" w:hAnsiTheme="majorHAnsi" w:cstheme="majorBidi"/>
+          <w:color w:val="000000" w:themeColor="text1"/>
+          <w:lang w:val="pt-BR"/>
+        </w:rPr>
+        <w:t>up</w:t>
+      </w:r>
+      <w:proofErr w:type="spellEnd"/>
+      <w:r>
+        <w:rPr>
+          <w:rFonts w:asciiTheme="majorHAnsi" w:eastAsiaTheme="majorEastAsia" w:hAnsiTheme="majorHAnsi" w:cstheme="majorBidi"/>
+          <w:color w:val="000000" w:themeColor="text1"/>
+          <w:lang w:val="pt-BR"/>
+        </w:rPr>
+        <w:t xml:space="preserve"> --build (O processo pode levar de 8 a 10 minutos. Caso seja um </w:t>
+      </w:r>
+      <w:proofErr w:type="spellStart"/>
+      <w:r>
+        <w:rPr>
+          <w:rFonts w:asciiTheme="majorHAnsi" w:eastAsiaTheme="majorEastAsia" w:hAnsiTheme="majorHAnsi" w:cstheme="majorBidi"/>
+          <w:color w:val="000000" w:themeColor="text1"/>
+          <w:lang w:val="pt-BR"/>
+        </w:rPr>
+        <w:t>deploy</w:t>
+      </w:r>
+      <w:proofErr w:type="spellEnd"/>
+      <w:r>
+        <w:rPr>
+          <w:rFonts w:asciiTheme="majorHAnsi" w:eastAsiaTheme="majorEastAsia" w:hAnsiTheme="majorHAnsi" w:cstheme="majorBidi"/>
+          <w:color w:val="000000" w:themeColor="text1"/>
+          <w:lang w:val="pt-BR"/>
+        </w:rPr>
+        <w:t xml:space="preserve"> em produção num servidor, adicione o parâmetro "-d" ao final para rodar em segundo plano). </w:t>
+      </w:r>
+    </w:p>
+    <w:p>
+      <w:pPr>
         <w:numPr>
           <w:ilvl w:val="0"/>
-          <w:numId w:val="11"/>
+          <w:numId w:val="18"/>
         </w:numPr>
         <w:rPr>
-          <w:lang w:val="pt-BR"/>
-        </w:rPr>
-      </w:pPr>
-      <w:r>
-        <w:rPr>
-          <w:lang w:val="pt-BR"/>
-        </w:rPr>
-        <w:t xml:space="preserve">SECRET: Assinatura secreta para a criptografia de tokens JWT no Spring Security. Deve ser uma </w:t>
-      </w:r>
-      <w:proofErr w:type="spellStart"/>
-      <w:r>
-        <w:rPr>
-          <w:lang w:val="pt-BR"/>
-        </w:rPr>
-        <w:t>string</w:t>
-      </w:r>
-      <w:proofErr w:type="spellEnd"/>
-      <w:r>
-        <w:rPr>
-          <w:lang w:val="pt-BR"/>
-        </w:rPr>
-        <w:t xml:space="preserve"> forte gerada aleatoriamente.</w:t>
+          <w:rFonts w:asciiTheme="majorHAnsi" w:eastAsiaTheme="majorEastAsia" w:hAnsiTheme="majorHAnsi" w:cstheme="majorBidi"/>
+          <w:color w:val="000000" w:themeColor="text1"/>
+          <w:lang w:val="pt-BR"/>
+        </w:rPr>
+      </w:pPr>
+      <w:r>
+        <w:rPr>
+          <w:rFonts w:asciiTheme="majorHAnsi" w:eastAsiaTheme="majorEastAsia" w:hAnsiTheme="majorHAnsi" w:cstheme="majorBidi"/>
+          <w:color w:val="000000" w:themeColor="text1"/>
+          <w:lang w:val="pt-BR"/>
+        </w:rPr>
+        <w:t>GARANTIA DE PERSISTÊNCIA E PROTOCOLO DE TESTES DE PORTAS</w:t>
       </w:r>
     </w:p>
     <w:p>
       <w:pPr>
-        <w:pStyle w:val="Commarcadores"/>
+        <w:rPr>
+          <w:rFonts w:asciiTheme="majorHAnsi" w:eastAsiaTheme="majorEastAsia" w:hAnsiTheme="majorHAnsi" w:cstheme="majorBidi"/>
+          <w:color w:val="000000" w:themeColor="text1"/>
+          <w:lang w:val="pt-BR"/>
+        </w:rPr>
+      </w:pPr>
+      <w:r>
+        <w:rPr>
+          <w:rFonts w:asciiTheme="majorHAnsi" w:eastAsiaTheme="majorEastAsia" w:hAnsiTheme="majorHAnsi" w:cstheme="majorBidi"/>
+          <w:color w:val="000000" w:themeColor="text1"/>
+          <w:lang w:val="pt-BR"/>
+        </w:rPr>
+        <w:lastRenderedPageBreak/>
+        <w:t>Para homologar que o sistema está 100% pronto para o servidor partilhado sem quebrar as regras de rede ou conflitar com outros sistemas, execute o seguinte roteiro de testes locais:</w:t>
+      </w:r>
+    </w:p>
+    <w:p>
+      <w:pPr>
         <w:numPr>
           <w:ilvl w:val="0"/>
-          <w:numId w:val="12"/>
+          <w:numId w:val="18"/>
         </w:numPr>
         <w:rPr>
-          <w:lang w:val="pt-BR"/>
-        </w:rPr>
-      </w:pPr>
-      <w:r>
-        <w:rPr>
-          <w:lang w:val="pt-BR"/>
-        </w:rPr>
-        <w:t>MATCH_API_KEY: Chave de segurança para validar a comunicação restrita entre a API Java e a API Python, impedindo requisições externas diretas.</w:t>
+          <w:rFonts w:asciiTheme="majorHAnsi" w:eastAsiaTheme="majorEastAsia" w:hAnsiTheme="majorHAnsi" w:cstheme="majorBidi"/>
+          <w:color w:val="000000" w:themeColor="text1"/>
+          <w:lang w:val="pt-BR"/>
+        </w:rPr>
+      </w:pPr>
+      <w:r>
+        <w:rPr>
+          <w:rFonts w:asciiTheme="majorHAnsi" w:eastAsiaTheme="majorEastAsia" w:hAnsiTheme="majorHAnsi" w:cstheme="majorBidi"/>
+          <w:color w:val="000000" w:themeColor="text1"/>
+          <w:lang w:val="pt-BR"/>
+        </w:rPr>
+        <w:t xml:space="preserve">Teste de Persistência (Volumes): O arquivo </w:t>
+      </w:r>
+      <w:proofErr w:type="spellStart"/>
+      <w:r>
+        <w:rPr>
+          <w:rFonts w:asciiTheme="majorHAnsi" w:eastAsiaTheme="majorEastAsia" w:hAnsiTheme="majorHAnsi" w:cstheme="majorBidi"/>
+          <w:color w:val="000000" w:themeColor="text1"/>
+          <w:lang w:val="pt-BR"/>
+        </w:rPr>
+        <w:t>compose</w:t>
+      </w:r>
+      <w:proofErr w:type="spellEnd"/>
+      <w:r>
+        <w:rPr>
+          <w:rFonts w:asciiTheme="majorHAnsi" w:eastAsiaTheme="majorEastAsia" w:hAnsiTheme="majorHAnsi" w:cstheme="majorBidi"/>
+          <w:color w:val="000000" w:themeColor="text1"/>
+          <w:lang w:val="pt-BR"/>
+        </w:rPr>
+        <w:t xml:space="preserve"> está configurado com mapeamento de volumes locais estáveis. Suba a aplicação e cadastre dados de teste. Execute no terminal o comando "</w:t>
+      </w:r>
+      <w:proofErr w:type="spellStart"/>
+      <w:r>
+        <w:rPr>
+          <w:rFonts w:asciiTheme="majorHAnsi" w:eastAsiaTheme="majorEastAsia" w:hAnsiTheme="majorHAnsi" w:cstheme="majorBidi"/>
+          <w:color w:val="000000" w:themeColor="text1"/>
+          <w:lang w:val="pt-BR"/>
+        </w:rPr>
+        <w:t>docker</w:t>
+      </w:r>
+      <w:proofErr w:type="spellEnd"/>
+      <w:r>
+        <w:rPr>
+          <w:rFonts w:asciiTheme="majorHAnsi" w:eastAsiaTheme="majorEastAsia" w:hAnsiTheme="majorHAnsi" w:cstheme="majorBidi"/>
+          <w:color w:val="000000" w:themeColor="text1"/>
+          <w:lang w:val="pt-BR"/>
+        </w:rPr>
+        <w:t xml:space="preserve"> </w:t>
+      </w:r>
+      <w:proofErr w:type="spellStart"/>
+      <w:r>
+        <w:rPr>
+          <w:rFonts w:asciiTheme="majorHAnsi" w:eastAsiaTheme="majorEastAsia" w:hAnsiTheme="majorHAnsi" w:cstheme="majorBidi"/>
+          <w:color w:val="000000" w:themeColor="text1"/>
+          <w:lang w:val="pt-BR"/>
+        </w:rPr>
+        <w:t>compose</w:t>
+      </w:r>
+      <w:proofErr w:type="spellEnd"/>
+      <w:r>
+        <w:rPr>
+          <w:rFonts w:asciiTheme="majorHAnsi" w:eastAsiaTheme="majorEastAsia" w:hAnsiTheme="majorHAnsi" w:cstheme="majorBidi"/>
+          <w:color w:val="000000" w:themeColor="text1"/>
+          <w:lang w:val="pt-BR"/>
+        </w:rPr>
+        <w:t xml:space="preserve"> </w:t>
+      </w:r>
+      <w:proofErr w:type="spellStart"/>
+      <w:r>
+        <w:rPr>
+          <w:rFonts w:asciiTheme="majorHAnsi" w:eastAsiaTheme="majorEastAsia" w:hAnsiTheme="majorHAnsi" w:cstheme="majorBidi"/>
+          <w:color w:val="000000" w:themeColor="text1"/>
+          <w:lang w:val="pt-BR"/>
+        </w:rPr>
+        <w:t>down</w:t>
+      </w:r>
+      <w:proofErr w:type="spellEnd"/>
+      <w:r>
+        <w:rPr>
+          <w:rFonts w:asciiTheme="majorHAnsi" w:eastAsiaTheme="majorEastAsia" w:hAnsiTheme="majorHAnsi" w:cstheme="majorBidi"/>
+          <w:color w:val="000000" w:themeColor="text1"/>
+          <w:lang w:val="pt-BR"/>
+        </w:rPr>
+        <w:t>" para encerrar os contêineres. Em seguida, suba novamente com "</w:t>
+      </w:r>
+      <w:proofErr w:type="spellStart"/>
+      <w:r>
+        <w:rPr>
+          <w:rFonts w:asciiTheme="majorHAnsi" w:eastAsiaTheme="majorEastAsia" w:hAnsiTheme="majorHAnsi" w:cstheme="majorBidi"/>
+          <w:color w:val="000000" w:themeColor="text1"/>
+          <w:lang w:val="pt-BR"/>
+        </w:rPr>
+        <w:t>docker</w:t>
+      </w:r>
+      <w:proofErr w:type="spellEnd"/>
+      <w:r>
+        <w:rPr>
+          <w:rFonts w:asciiTheme="majorHAnsi" w:eastAsiaTheme="majorEastAsia" w:hAnsiTheme="majorHAnsi" w:cstheme="majorBidi"/>
+          <w:color w:val="000000" w:themeColor="text1"/>
+          <w:lang w:val="pt-BR"/>
+        </w:rPr>
+        <w:t xml:space="preserve"> </w:t>
+      </w:r>
+      <w:proofErr w:type="spellStart"/>
+      <w:r>
+        <w:rPr>
+          <w:rFonts w:asciiTheme="majorHAnsi" w:eastAsiaTheme="majorEastAsia" w:hAnsiTheme="majorHAnsi" w:cstheme="majorBidi"/>
+          <w:color w:val="000000" w:themeColor="text1"/>
+          <w:lang w:val="pt-BR"/>
+        </w:rPr>
+        <w:t>compose</w:t>
+      </w:r>
+      <w:proofErr w:type="spellEnd"/>
+      <w:r>
+        <w:rPr>
+          <w:rFonts w:asciiTheme="majorHAnsi" w:eastAsiaTheme="majorEastAsia" w:hAnsiTheme="majorHAnsi" w:cstheme="majorBidi"/>
+          <w:color w:val="000000" w:themeColor="text1"/>
+          <w:lang w:val="pt-BR"/>
+        </w:rPr>
+        <w:t xml:space="preserve"> </w:t>
+      </w:r>
+      <w:proofErr w:type="spellStart"/>
+      <w:r>
+        <w:rPr>
+          <w:rFonts w:asciiTheme="majorHAnsi" w:eastAsiaTheme="majorEastAsia" w:hAnsiTheme="majorHAnsi" w:cstheme="majorBidi"/>
+          <w:color w:val="000000" w:themeColor="text1"/>
+          <w:lang w:val="pt-BR"/>
+        </w:rPr>
+        <w:t>up</w:t>
+      </w:r>
+      <w:proofErr w:type="spellEnd"/>
+      <w:r>
+        <w:rPr>
+          <w:rFonts w:asciiTheme="majorHAnsi" w:eastAsiaTheme="majorEastAsia" w:hAnsiTheme="majorHAnsi" w:cstheme="majorBidi"/>
+          <w:color w:val="000000" w:themeColor="text1"/>
+          <w:lang w:val="pt-BR"/>
+        </w:rPr>
+        <w:t>". Certifique-se de que o sistema NÃO apagou e nem recriou o banco de dados zerado. Os dados devem permanecer intactos.</w:t>
       </w:r>
     </w:p>
     <w:p>
       <w:pPr>
-        <w:pStyle w:val="Commarcadores"/>
         <w:numPr>
           <w:ilvl w:val="0"/>
-          <w:numId w:val="13"/>
+          <w:numId w:val="18"/>
         </w:numPr>
         <w:rPr>
-          <w:lang w:val="pt-BR"/>
-        </w:rPr>
-      </w:pPr>
-      <w:r>
-        <w:rPr>
-          <w:lang w:val="pt-BR"/>
-        </w:rPr>
-        <w:t>MAIL_PASSWORD: Utilizada para disparar e-mails de recuperação. É necessário criar uma "Senha de Aplicativo" na conta Google (em "Segurança" &gt; "Verificação em duas etapas") e inserir a senha gerada (16 letras) neste campo.</w:t>
+          <w:rFonts w:asciiTheme="majorHAnsi" w:eastAsiaTheme="majorEastAsia" w:hAnsiTheme="majorHAnsi" w:cstheme="majorBidi"/>
+          <w:color w:val="000000" w:themeColor="text1"/>
+          <w:lang w:val="pt-BR"/>
+        </w:rPr>
+      </w:pPr>
+      <w:r>
+        <w:rPr>
+          <w:rFonts w:asciiTheme="majorHAnsi" w:eastAsiaTheme="majorEastAsia" w:hAnsiTheme="majorHAnsi" w:cstheme="majorBidi"/>
+          <w:color w:val="000000" w:themeColor="text1"/>
+          <w:lang w:val="pt-BR"/>
+        </w:rPr>
+        <w:t>Limpeza Total de Ambiente: Caso queira limpar o ambiente de desenvolvimento e resetar os volumes intencionalmente, execute o comando "</w:t>
+      </w:r>
+      <w:proofErr w:type="spellStart"/>
+      <w:r>
+        <w:rPr>
+          <w:rFonts w:asciiTheme="majorHAnsi" w:eastAsiaTheme="majorEastAsia" w:hAnsiTheme="majorHAnsi" w:cstheme="majorBidi"/>
+          <w:color w:val="000000" w:themeColor="text1"/>
+          <w:lang w:val="pt-BR"/>
+        </w:rPr>
+        <w:t>docker</w:t>
+      </w:r>
+      <w:proofErr w:type="spellEnd"/>
+      <w:r>
+        <w:rPr>
+          <w:rFonts w:asciiTheme="majorHAnsi" w:eastAsiaTheme="majorEastAsia" w:hAnsiTheme="majorHAnsi" w:cstheme="majorBidi"/>
+          <w:color w:val="000000" w:themeColor="text1"/>
+          <w:lang w:val="pt-BR"/>
+        </w:rPr>
+        <w:t xml:space="preserve"> </w:t>
+      </w:r>
+      <w:proofErr w:type="spellStart"/>
+      <w:r>
+        <w:rPr>
+          <w:rFonts w:asciiTheme="majorHAnsi" w:eastAsiaTheme="majorEastAsia" w:hAnsiTheme="majorHAnsi" w:cstheme="majorBidi"/>
+          <w:color w:val="000000" w:themeColor="text1"/>
+          <w:lang w:val="pt-BR"/>
+        </w:rPr>
+        <w:t>compose</w:t>
+      </w:r>
+      <w:proofErr w:type="spellEnd"/>
+      <w:r>
+        <w:rPr>
+          <w:rFonts w:asciiTheme="majorHAnsi" w:eastAsiaTheme="majorEastAsia" w:hAnsiTheme="majorHAnsi" w:cstheme="majorBidi"/>
+          <w:color w:val="000000" w:themeColor="text1"/>
+          <w:lang w:val="pt-BR"/>
+        </w:rPr>
+        <w:t xml:space="preserve"> </w:t>
+      </w:r>
+      <w:proofErr w:type="spellStart"/>
+      <w:r>
+        <w:rPr>
+          <w:rFonts w:asciiTheme="majorHAnsi" w:eastAsiaTheme="majorEastAsia" w:hAnsiTheme="majorHAnsi" w:cstheme="majorBidi"/>
+          <w:color w:val="000000" w:themeColor="text1"/>
+          <w:lang w:val="pt-BR"/>
+        </w:rPr>
+        <w:t>down</w:t>
+      </w:r>
+      <w:proofErr w:type="spellEnd"/>
+      <w:r>
+        <w:rPr>
+          <w:rFonts w:asciiTheme="majorHAnsi" w:eastAsiaTheme="majorEastAsia" w:hAnsiTheme="majorHAnsi" w:cstheme="majorBidi"/>
+          <w:color w:val="000000" w:themeColor="text1"/>
+          <w:lang w:val="pt-BR"/>
+        </w:rPr>
+        <w:t xml:space="preserve"> -v". Para reconstruir a aplicação completa do zero, utilize "</w:t>
+      </w:r>
+      <w:proofErr w:type="spellStart"/>
+      <w:r>
+        <w:rPr>
+          <w:rFonts w:asciiTheme="majorHAnsi" w:eastAsiaTheme="majorEastAsia" w:hAnsiTheme="majorHAnsi" w:cstheme="majorBidi"/>
+          <w:color w:val="000000" w:themeColor="text1"/>
+          <w:lang w:val="pt-BR"/>
+        </w:rPr>
+        <w:t>docker</w:t>
+      </w:r>
+      <w:proofErr w:type="spellEnd"/>
+      <w:r>
+        <w:rPr>
+          <w:rFonts w:asciiTheme="majorHAnsi" w:eastAsiaTheme="majorEastAsia" w:hAnsiTheme="majorHAnsi" w:cstheme="majorBidi"/>
+          <w:color w:val="000000" w:themeColor="text1"/>
+          <w:lang w:val="pt-BR"/>
+        </w:rPr>
+        <w:t xml:space="preserve"> </w:t>
+      </w:r>
+      <w:proofErr w:type="spellStart"/>
+      <w:r>
+        <w:rPr>
+          <w:rFonts w:asciiTheme="majorHAnsi" w:eastAsiaTheme="majorEastAsia" w:hAnsiTheme="majorHAnsi" w:cstheme="majorBidi"/>
+          <w:color w:val="000000" w:themeColor="text1"/>
+          <w:lang w:val="pt-BR"/>
+        </w:rPr>
+        <w:t>compose</w:t>
+      </w:r>
+      <w:proofErr w:type="spellEnd"/>
+      <w:r>
+        <w:rPr>
+          <w:rFonts w:asciiTheme="majorHAnsi" w:eastAsiaTheme="majorEastAsia" w:hAnsiTheme="majorHAnsi" w:cstheme="majorBidi"/>
+          <w:color w:val="000000" w:themeColor="text1"/>
+          <w:lang w:val="pt-BR"/>
+        </w:rPr>
+        <w:t xml:space="preserve"> </w:t>
+      </w:r>
+      <w:proofErr w:type="spellStart"/>
+      <w:r>
+        <w:rPr>
+          <w:rFonts w:asciiTheme="majorHAnsi" w:eastAsiaTheme="majorEastAsia" w:hAnsiTheme="majorHAnsi" w:cstheme="majorBidi"/>
+          <w:color w:val="000000" w:themeColor="text1"/>
+          <w:lang w:val="pt-BR"/>
+        </w:rPr>
+        <w:t>up</w:t>
+      </w:r>
+      <w:proofErr w:type="spellEnd"/>
+      <w:r>
+        <w:rPr>
+          <w:rFonts w:asciiTheme="majorHAnsi" w:eastAsiaTheme="majorEastAsia" w:hAnsiTheme="majorHAnsi" w:cstheme="majorBidi"/>
+          <w:color w:val="000000" w:themeColor="text1"/>
+          <w:lang w:val="pt-BR"/>
+        </w:rPr>
+        <w:t xml:space="preserve"> --build".</w:t>
       </w:r>
     </w:p>
     <w:p>
       <w:pPr>
-        <w:spacing w:after="0"/>
-      </w:pPr>
+        <w:numPr>
+          <w:ilvl w:val="0"/>
+          <w:numId w:val="18"/>
+        </w:numPr>
+        <w:rPr>
+          <w:rFonts w:asciiTheme="majorHAnsi" w:eastAsiaTheme="majorEastAsia" w:hAnsiTheme="majorHAnsi" w:cstheme="majorBidi"/>
+          <w:color w:val="000000" w:themeColor="text1"/>
+          <w:lang w:val="pt-BR"/>
+        </w:rPr>
+      </w:pPr>
+      <w:r>
+        <w:rPr>
+          <w:rFonts w:asciiTheme="majorHAnsi" w:eastAsiaTheme="majorEastAsia" w:hAnsiTheme="majorHAnsi" w:cstheme="majorBidi"/>
+          <w:color w:val="000000" w:themeColor="text1"/>
+          <w:lang w:val="pt-BR"/>
+        </w:rPr>
+        <w:t xml:space="preserve">Simulação de Conflito de Portas: Altere o valor da esquerda do </w:t>
+      </w:r>
+      <w:proofErr w:type="spellStart"/>
+      <w:r>
+        <w:rPr>
+          <w:rFonts w:asciiTheme="majorHAnsi" w:eastAsiaTheme="majorEastAsia" w:hAnsiTheme="majorHAnsi" w:cstheme="majorBidi"/>
+          <w:color w:val="000000" w:themeColor="text1"/>
+          <w:lang w:val="pt-BR"/>
+        </w:rPr>
+        <w:t>Frontend</w:t>
+      </w:r>
+      <w:proofErr w:type="spellEnd"/>
+      <w:r>
+        <w:rPr>
+          <w:rFonts w:asciiTheme="majorHAnsi" w:eastAsiaTheme="majorEastAsia" w:hAnsiTheme="majorHAnsi" w:cstheme="majorBidi"/>
+          <w:color w:val="000000" w:themeColor="text1"/>
+          <w:lang w:val="pt-BR"/>
+        </w:rPr>
+        <w:t xml:space="preserve"> no arquivo "</w:t>
+      </w:r>
+      <w:proofErr w:type="spellStart"/>
+      <w:r>
+        <w:rPr>
+          <w:rFonts w:asciiTheme="majorHAnsi" w:eastAsiaTheme="majorEastAsia" w:hAnsiTheme="majorHAnsi" w:cstheme="majorBidi"/>
+          <w:color w:val="000000" w:themeColor="text1"/>
+          <w:lang w:val="pt-BR"/>
+        </w:rPr>
+        <w:t>docker-compose.yml</w:t>
+      </w:r>
+      <w:proofErr w:type="spellEnd"/>
+      <w:r>
+        <w:rPr>
+          <w:rFonts w:asciiTheme="majorHAnsi" w:eastAsiaTheme="majorEastAsia" w:hAnsiTheme="majorHAnsi" w:cstheme="majorBidi"/>
+          <w:color w:val="000000" w:themeColor="text1"/>
+          <w:lang w:val="pt-BR"/>
+        </w:rPr>
+        <w:t>" (Exemplo: altere de "5173:5173" para "8090:5173"). Suba o sistema e valide o acesso do usuário pelo endereço alternativo "http://localhost:8090". Verifique se a interface carrega perfeitamente e se o fluxo de Match e Chat em tempo real (</w:t>
+      </w:r>
+      <w:proofErr w:type="spellStart"/>
+      <w:r>
+        <w:rPr>
+          <w:rFonts w:asciiTheme="majorHAnsi" w:eastAsiaTheme="majorEastAsia" w:hAnsiTheme="majorHAnsi" w:cstheme="majorBidi"/>
+          <w:color w:val="000000" w:themeColor="text1"/>
+          <w:lang w:val="pt-BR"/>
+        </w:rPr>
+        <w:t>WebSocket</w:t>
+      </w:r>
+      <w:proofErr w:type="spellEnd"/>
+      <w:r>
+        <w:rPr>
+          <w:rFonts w:asciiTheme="majorHAnsi" w:eastAsiaTheme="majorEastAsia" w:hAnsiTheme="majorHAnsi" w:cstheme="majorBidi"/>
+          <w:color w:val="000000" w:themeColor="text1"/>
+          <w:lang w:val="pt-BR"/>
+        </w:rPr>
+        <w:t>) continua operando sem interrupções.</w:t>
+      </w:r>
     </w:p>
     <w:p>
       <w:pPr>
-        <w:spacing w:after="0"/>
-      </w:pPr>
-    </w:p>
-    <w:p>
-      <w:pPr>
-        <w:spacing w:after="0"/>
-      </w:pPr>
-    </w:p>
-    <w:p>
-      <w:pPr>
-        <w:spacing w:after="0"/>
-      </w:pPr>
-    </w:p>
-    <w:p>
-      <w:pPr>
-        <w:spacing w:after="0"/>
-      </w:pPr>
-    </w:p>
-    <w:p>
-      <w:pPr>
-        <w:spacing w:after="0"/>
-      </w:pPr>
-      <w:r>
-        <w:t>III. Subir os containers Docker:</w:t>
-      </w:r>
-    </w:p>
-    <w:p>
-      <w:pPr>
-        <w:pStyle w:val="CitaoIntensa"/>
-      </w:pPr>
-      <w:r>
-        <w:t>docker-compose up --build</w:t>
-      </w:r>
-    </w:p>
-    <w:p>
-      <w:pPr>
-        <w:rPr>
-          <w:u w:val="single"/>
-        </w:rPr>
-      </w:pPr>
-      <w:r>
-        <w:t xml:space="preserve">O processo pode levar de 8 a 10 </w:t>
+        <w:numPr>
+          <w:ilvl w:val="0"/>
+          <w:numId w:val="18"/>
+        </w:numPr>
+        <w:rPr>
+          <w:rFonts w:asciiTheme="majorHAnsi" w:eastAsiaTheme="majorEastAsia" w:hAnsiTheme="majorHAnsi" w:cstheme="majorBidi"/>
+          <w:color w:val="000000" w:themeColor="text1"/>
+          <w:lang w:val="pt-BR"/>
+        </w:rPr>
+      </w:pPr>
+      <w:r>
+        <w:rPr>
+          <w:rFonts w:asciiTheme="majorHAnsi" w:eastAsiaTheme="majorEastAsia" w:hAnsiTheme="majorHAnsi" w:cstheme="majorBidi"/>
+          <w:color w:val="000000" w:themeColor="text1"/>
+          <w:lang w:val="pt-BR"/>
+        </w:rPr>
+        <w:t xml:space="preserve">Verificação de Isolamento de Rede: Utilizando um gerenciador externo de banco de dados (como </w:t>
       </w:r>
       <w:proofErr w:type="spellStart"/>
       <w:r>
-        <w:t>minutos</w:t>
+        <w:rPr>
+          <w:rFonts w:asciiTheme="majorHAnsi" w:eastAsiaTheme="majorEastAsia" w:hAnsiTheme="majorHAnsi" w:cstheme="majorBidi"/>
+          <w:color w:val="000000" w:themeColor="text1"/>
+          <w:lang w:val="pt-BR"/>
+        </w:rPr>
+        <w:t>DBeaver</w:t>
       </w:r>
       <w:proofErr w:type="spellEnd"/>
       <w:r>
-        <w:t xml:space="preserve"> (</w:t>
+        <w:rPr>
+          <w:rFonts w:asciiTheme="majorHAnsi" w:eastAsiaTheme="majorEastAsia" w:hAnsiTheme="majorHAnsi" w:cstheme="majorBidi"/>
+          <w:color w:val="000000" w:themeColor="text1"/>
+          <w:lang w:val="pt-BR"/>
+        </w:rPr>
+        <w:t xml:space="preserve"> ou Compass) conectado ao IP da máquina, tente forçar um acesso direto às portas 5432 (PostgreSQL) ou 27017 (</w:t>
       </w:r>
       <w:proofErr w:type="spellStart"/>
       <w:r>
-        <w:t>Dependendo</w:t>
+        <w:rPr>
+          <w:rFonts w:asciiTheme="majorHAnsi" w:eastAsiaTheme="majorEastAsia" w:hAnsiTheme="majorHAnsi" w:cstheme="majorBidi"/>
+          <w:color w:val="000000" w:themeColor="text1"/>
+          <w:lang w:val="pt-BR"/>
+        </w:rPr>
+        <w:t>MongoDB</w:t>
       </w:r>
       <w:proofErr w:type="spellEnd"/>
       <w:r>
-        <w:t xml:space="preserve"> da </w:t>
-      </w:r>
-      <w:proofErr w:type="spellStart"/>
-      <w:r>
-        <w:t>máquina</w:t>
-      </w:r>
-      <w:proofErr w:type="spellEnd"/>
-      <w:r>
-        <w:t xml:space="preserve"> </w:t>
-      </w:r>
-      <w:proofErr w:type="spellStart"/>
-      <w:r>
-        <w:t>pode</w:t>
-      </w:r>
-      <w:proofErr w:type="spellEnd"/>
-      <w:r>
-        <w:t xml:space="preserve"> </w:t>
-      </w:r>
-      <w:proofErr w:type="spellStart"/>
-      <w:r>
-        <w:t>demorar</w:t>
-      </w:r>
-      <w:proofErr w:type="spellEnd"/>
-      <w:r>
-        <w:t xml:space="preserve"> </w:t>
-      </w:r>
-      <w:proofErr w:type="spellStart"/>
-      <w:r>
-        <w:t>até</w:t>
-      </w:r>
-      <w:proofErr w:type="spellEnd"/>
-      <w:r>
-        <w:t xml:space="preserve"> </w:t>
-      </w:r>
-      <w:proofErr w:type="spellStart"/>
-      <w:r>
-        <w:t>mais</w:t>
-      </w:r>
-      <w:proofErr w:type="spellEnd"/>
-      <w:r>
-        <w:t>)</w:t>
-      </w:r>
-      <w:r>
-        <w:rPr>
-          <w:u w:val="single"/>
-        </w:rPr>
-        <w:t>.</w:t>
-      </w:r>
-    </w:p>
-    <w:p>
-      <w:r>
-        <w:rPr>
-          <w:i/>
-          <w:iCs/>
-        </w:rPr>
-        <w:t xml:space="preserve">Nota de </w:t>
-      </w:r>
-      <w:proofErr w:type="spellStart"/>
-      <w:r>
-        <w:rPr>
-          <w:i/>
-          <w:iCs/>
-        </w:rPr>
-        <w:t>Persistência</w:t>
-      </w:r>
-      <w:proofErr w:type="spellEnd"/>
-      <w:r>
-        <w:rPr>
-          <w:i/>
-          <w:iCs/>
-        </w:rPr>
-        <w:t>:</w:t>
-      </w:r>
-      <w:r>
-        <w:t xml:space="preserve"> O </w:t>
-      </w:r>
-      <w:proofErr w:type="spellStart"/>
-      <w:r>
-        <w:t>arquivo</w:t>
-      </w:r>
-      <w:proofErr w:type="spellEnd"/>
-      <w:r>
-        <w:t xml:space="preserve"> compose </w:t>
-      </w:r>
-      <w:proofErr w:type="spellStart"/>
-      <w:r>
-        <w:t>está</w:t>
-      </w:r>
-      <w:proofErr w:type="spellEnd"/>
-      <w:r>
-        <w:t xml:space="preserve"> </w:t>
-      </w:r>
-      <w:proofErr w:type="spellStart"/>
-      <w:r>
-        <w:t>configurado</w:t>
-      </w:r>
-      <w:proofErr w:type="spellEnd"/>
-      <w:r>
-        <w:t xml:space="preserve"> com </w:t>
-      </w:r>
-      <w:proofErr w:type="spellStart"/>
-      <w:r>
-        <w:t>mapeamento</w:t>
-      </w:r>
-      <w:proofErr w:type="spellEnd"/>
-      <w:r>
-        <w:t xml:space="preserve"> de </w:t>
-      </w:r>
-      <w:r>
-        <w:rPr>
-          <w:i/>
-          <w:iCs/>
-        </w:rPr>
-        <w:t>volumes</w:t>
-      </w:r>
-      <w:r>
-        <w:t xml:space="preserve"> </w:t>
-      </w:r>
-      <w:proofErr w:type="spellStart"/>
-      <w:r>
-        <w:t>locais</w:t>
-      </w:r>
-      <w:proofErr w:type="spellEnd"/>
-      <w:r>
-        <w:t xml:space="preserve">. Em </w:t>
-      </w:r>
-      <w:proofErr w:type="spellStart"/>
-      <w:r>
-        <w:t>caso</w:t>
-      </w:r>
-      <w:proofErr w:type="spellEnd"/>
-      <w:r>
-        <w:t xml:space="preserve"> de </w:t>
-      </w:r>
-      <w:proofErr w:type="spellStart"/>
-      <w:r>
-        <w:t>manutenção</w:t>
-      </w:r>
-      <w:proofErr w:type="spellEnd"/>
-      <w:r>
-        <w:t xml:space="preserve">, </w:t>
-      </w:r>
-      <w:proofErr w:type="spellStart"/>
-      <w:r>
-        <w:t>executar</w:t>
-      </w:r>
-      <w:proofErr w:type="spellEnd"/>
-      <w:r>
-        <w:t xml:space="preserve"> docker compose down </w:t>
-      </w:r>
-      <w:proofErr w:type="spellStart"/>
-      <w:r>
-        <w:t>encerrará</w:t>
-      </w:r>
-      <w:proofErr w:type="spellEnd"/>
-      <w:r>
-        <w:t xml:space="preserve"> o </w:t>
-      </w:r>
-      <w:proofErr w:type="spellStart"/>
-      <w:r>
-        <w:t>sistema</w:t>
-      </w:r>
-      <w:proofErr w:type="spellEnd"/>
-      <w:r>
-        <w:t xml:space="preserve">, mas </w:t>
-      </w:r>
-      <w:proofErr w:type="spellStart"/>
-      <w:r>
-        <w:rPr>
-          <w:b/>
-          <w:bCs/>
-        </w:rPr>
-        <w:t>não</w:t>
-      </w:r>
-      <w:proofErr w:type="spellEnd"/>
-      <w:r>
-        <w:t xml:space="preserve"> </w:t>
-      </w:r>
-      <w:proofErr w:type="spellStart"/>
-      <w:r>
-        <w:t>apagará</w:t>
-      </w:r>
-      <w:proofErr w:type="spellEnd"/>
-      <w:r>
-        <w:t xml:space="preserve"> o banco de dados. Para </w:t>
-      </w:r>
-      <w:proofErr w:type="spellStart"/>
-      <w:r>
-        <w:t>forçar</w:t>
-      </w:r>
-      <w:proofErr w:type="spellEnd"/>
-      <w:r>
-        <w:t xml:space="preserve"> a </w:t>
-      </w:r>
-      <w:proofErr w:type="spellStart"/>
-      <w:r>
-        <w:t>recriação</w:t>
-      </w:r>
-      <w:proofErr w:type="spellEnd"/>
-      <w:r>
-        <w:t xml:space="preserve"> limpa e </w:t>
-      </w:r>
-      <w:proofErr w:type="spellStart"/>
-      <w:r>
-        <w:t>deletar</w:t>
-      </w:r>
-      <w:proofErr w:type="spellEnd"/>
-      <w:r>
-        <w:t xml:space="preserve"> o banco </w:t>
-      </w:r>
-      <w:proofErr w:type="spellStart"/>
-      <w:r>
-        <w:t>zerado</w:t>
-      </w:r>
-      <w:proofErr w:type="spellEnd"/>
-      <w:r>
-        <w:t>, utilize docker compose down -v.</w:t>
-      </w:r>
-    </w:p>
-    <w:p/>
-    <w:p>
-      <w:r>
-        <w:t xml:space="preserve">IV. Após o download, aguarde </w:t>
-      </w:r>
-      <w:proofErr w:type="gramStart"/>
-      <w:r>
-        <w:t>a</w:t>
-      </w:r>
-      <w:proofErr w:type="gramEnd"/>
-      <w:r>
-        <w:t xml:space="preserve"> inicialização completa dos containers e verifique os logs para garantir </w:t>
-      </w:r>
-      <w:proofErr w:type="spellStart"/>
-      <w:r>
-        <w:t>que</w:t>
-      </w:r>
-      <w:proofErr w:type="spellEnd"/>
-      <w:r>
-        <w:t xml:space="preserve"> </w:t>
-      </w:r>
-      <w:proofErr w:type="spellStart"/>
-      <w:r>
-        <w:t>não</w:t>
-      </w:r>
-      <w:proofErr w:type="spellEnd"/>
-      <w:r>
-        <w:t xml:space="preserve"> </w:t>
-      </w:r>
-      <w:proofErr w:type="spellStart"/>
-      <w:r>
-        <w:t>houve</w:t>
-      </w:r>
-      <w:proofErr w:type="spellEnd"/>
-      <w:r>
-        <w:t xml:space="preserve"> </w:t>
-      </w:r>
-      <w:proofErr w:type="spellStart"/>
-      <w:r>
-        <w:t>erros</w:t>
-      </w:r>
-      <w:proofErr w:type="spellEnd"/>
-      <w:r>
-        <w:t>.</w:t>
+        <w:rPr>
+          <w:rFonts w:asciiTheme="majorHAnsi" w:eastAsiaTheme="majorEastAsia" w:hAnsiTheme="majorHAnsi" w:cstheme="majorBidi"/>
+          <w:color w:val="000000" w:themeColor="text1"/>
+          <w:lang w:val="pt-BR"/>
+        </w:rPr>
+        <w:t>). O acesso externo deve ser completamente recusado, provando o isolamento bem-sucedido dos dados para o ambiente de produção.</w:t>
       </w:r>
     </w:p>
     <w:p/>
@@ -1994,6 +3045,124 @@
     </w:lvl>
   </w:abstractNum>
   <w:abstractNum w:abstractNumId="9" w15:restartNumberingAfterBreak="0">
+    <w:nsid w:val="09506756"/>
+    <w:multiLevelType w:val="multilevel"/>
+    <w:tmpl w:val="F0E068A6"/>
+    <w:lvl w:ilvl="0">
+      <w:start w:val="2"/>
+      <w:numFmt w:val="decimal"/>
+      <w:lvlText w:val="%1."/>
+      <w:lvlJc w:val="left"/>
+      <w:pPr>
+        <w:tabs>
+          <w:tab w:val="num" w:pos="502"/>
+        </w:tabs>
+        <w:ind w:left="502" w:hanging="360"/>
+      </w:pPr>
+      <w:rPr>
+        <w:b/>
+        <w:bCs/>
+        <w:color w:val="4F81BD" w:themeColor="accent1"/>
+      </w:rPr>
+    </w:lvl>
+    <w:lvl w:ilvl="1" w:tentative="1">
+      <w:start w:val="1"/>
+      <w:numFmt w:val="decimal"/>
+      <w:lvlText w:val="%2."/>
+      <w:lvlJc w:val="left"/>
+      <w:pPr>
+        <w:tabs>
+          <w:tab w:val="num" w:pos="1222"/>
+        </w:tabs>
+        <w:ind w:left="1222" w:hanging="360"/>
+      </w:pPr>
+    </w:lvl>
+    <w:lvl w:ilvl="2" w:tentative="1">
+      <w:start w:val="1"/>
+      <w:numFmt w:val="decimal"/>
+      <w:lvlText w:val="%3."/>
+      <w:lvlJc w:val="left"/>
+      <w:pPr>
+        <w:tabs>
+          <w:tab w:val="num" w:pos="1942"/>
+        </w:tabs>
+        <w:ind w:left="1942" w:hanging="360"/>
+      </w:pPr>
+    </w:lvl>
+    <w:lvl w:ilvl="3" w:tentative="1">
+      <w:start w:val="1"/>
+      <w:numFmt w:val="decimal"/>
+      <w:lvlText w:val="%4."/>
+      <w:lvlJc w:val="left"/>
+      <w:pPr>
+        <w:tabs>
+          <w:tab w:val="num" w:pos="2662"/>
+        </w:tabs>
+        <w:ind w:left="2662" w:hanging="360"/>
+      </w:pPr>
+    </w:lvl>
+    <w:lvl w:ilvl="4" w:tentative="1">
+      <w:start w:val="1"/>
+      <w:numFmt w:val="decimal"/>
+      <w:lvlText w:val="%5."/>
+      <w:lvlJc w:val="left"/>
+      <w:pPr>
+        <w:tabs>
+          <w:tab w:val="num" w:pos="3382"/>
+        </w:tabs>
+        <w:ind w:left="3382" w:hanging="360"/>
+      </w:pPr>
+    </w:lvl>
+    <w:lvl w:ilvl="5" w:tentative="1">
+      <w:start w:val="1"/>
+      <w:numFmt w:val="decimal"/>
+      <w:lvlText w:val="%6."/>
+      <w:lvlJc w:val="left"/>
+      <w:pPr>
+        <w:tabs>
+          <w:tab w:val="num" w:pos="4102"/>
+        </w:tabs>
+        <w:ind w:left="4102" w:hanging="360"/>
+      </w:pPr>
+    </w:lvl>
+    <w:lvl w:ilvl="6" w:tentative="1">
+      <w:start w:val="1"/>
+      <w:numFmt w:val="decimal"/>
+      <w:lvlText w:val="%7."/>
+      <w:lvlJc w:val="left"/>
+      <w:pPr>
+        <w:tabs>
+          <w:tab w:val="num" w:pos="4822"/>
+        </w:tabs>
+        <w:ind w:left="4822" w:hanging="360"/>
+      </w:pPr>
+    </w:lvl>
+    <w:lvl w:ilvl="7" w:tentative="1">
+      <w:start w:val="1"/>
+      <w:numFmt w:val="decimal"/>
+      <w:lvlText w:val="%8."/>
+      <w:lvlJc w:val="left"/>
+      <w:pPr>
+        <w:tabs>
+          <w:tab w:val="num" w:pos="5542"/>
+        </w:tabs>
+        <w:ind w:left="5542" w:hanging="360"/>
+      </w:pPr>
+    </w:lvl>
+    <w:lvl w:ilvl="8" w:tentative="1">
+      <w:start w:val="1"/>
+      <w:numFmt w:val="decimal"/>
+      <w:lvlText w:val="%9."/>
+      <w:lvlJc w:val="left"/>
+      <w:pPr>
+        <w:tabs>
+          <w:tab w:val="num" w:pos="6262"/>
+        </w:tabs>
+        <w:ind w:left="6262" w:hanging="360"/>
+      </w:pPr>
+    </w:lvl>
+  </w:abstractNum>
+  <w:abstractNum w:abstractNumId="10" w15:restartNumberingAfterBreak="0">
     <w:nsid w:val="16365D60"/>
     <w:multiLevelType w:val="hybridMultilevel"/>
     <w:tmpl w:val="EA101C44"/>
@@ -2106,7 +3275,7 @@
       </w:rPr>
     </w:lvl>
   </w:abstractNum>
-  <w:abstractNum w:abstractNumId="10" w15:restartNumberingAfterBreak="0">
+  <w:abstractNum w:abstractNumId="11" w15:restartNumberingAfterBreak="0">
     <w:nsid w:val="1E945061"/>
     <w:multiLevelType w:val="hybridMultilevel"/>
     <w:tmpl w:val="CEA057F6"/>
@@ -2219,7 +3388,269 @@
       </w:rPr>
     </w:lvl>
   </w:abstractNum>
-  <w:abstractNum w:abstractNumId="11" w15:restartNumberingAfterBreak="0">
+  <w:abstractNum w:abstractNumId="12" w15:restartNumberingAfterBreak="0">
+    <w:nsid w:val="25247D8C"/>
+    <w:multiLevelType w:val="multilevel"/>
+    <w:tmpl w:val="814237AC"/>
+    <w:lvl w:ilvl="0">
+      <w:start w:val="1"/>
+      <w:numFmt w:val="bullet"/>
+      <w:lvlText w:val=""/>
+      <w:lvlJc w:val="left"/>
+      <w:pPr>
+        <w:tabs>
+          <w:tab w:val="num" w:pos="720"/>
+        </w:tabs>
+        <w:ind w:left="720" w:hanging="360"/>
+      </w:pPr>
+      <w:rPr>
+        <w:rFonts w:ascii="Symbol" w:hAnsi="Symbol" w:hint="default"/>
+        <w:sz w:val="20"/>
+      </w:rPr>
+    </w:lvl>
+    <w:lvl w:ilvl="1" w:tentative="1">
+      <w:start w:val="1"/>
+      <w:numFmt w:val="bullet"/>
+      <w:lvlText w:val="o"/>
+      <w:lvlJc w:val="left"/>
+      <w:pPr>
+        <w:tabs>
+          <w:tab w:val="num" w:pos="1440"/>
+        </w:tabs>
+        <w:ind w:left="1440" w:hanging="360"/>
+      </w:pPr>
+      <w:rPr>
+        <w:rFonts w:ascii="Courier New" w:hAnsi="Courier New" w:hint="default"/>
+        <w:sz w:val="20"/>
+      </w:rPr>
+    </w:lvl>
+    <w:lvl w:ilvl="2" w:tentative="1">
+      <w:start w:val="1"/>
+      <w:numFmt w:val="bullet"/>
+      <w:lvlText w:val=""/>
+      <w:lvlJc w:val="left"/>
+      <w:pPr>
+        <w:tabs>
+          <w:tab w:val="num" w:pos="2160"/>
+        </w:tabs>
+        <w:ind w:left="2160" w:hanging="360"/>
+      </w:pPr>
+      <w:rPr>
+        <w:rFonts w:ascii="Wingdings" w:hAnsi="Wingdings" w:hint="default"/>
+        <w:sz w:val="20"/>
+      </w:rPr>
+    </w:lvl>
+    <w:lvl w:ilvl="3" w:tentative="1">
+      <w:start w:val="1"/>
+      <w:numFmt w:val="bullet"/>
+      <w:lvlText w:val=""/>
+      <w:lvlJc w:val="left"/>
+      <w:pPr>
+        <w:tabs>
+          <w:tab w:val="num" w:pos="2880"/>
+        </w:tabs>
+        <w:ind w:left="2880" w:hanging="360"/>
+      </w:pPr>
+      <w:rPr>
+        <w:rFonts w:ascii="Wingdings" w:hAnsi="Wingdings" w:hint="default"/>
+        <w:sz w:val="20"/>
+      </w:rPr>
+    </w:lvl>
+    <w:lvl w:ilvl="4" w:tentative="1">
+      <w:start w:val="1"/>
+      <w:numFmt w:val="bullet"/>
+      <w:lvlText w:val=""/>
+      <w:lvlJc w:val="left"/>
+      <w:pPr>
+        <w:tabs>
+          <w:tab w:val="num" w:pos="3600"/>
+        </w:tabs>
+        <w:ind w:left="3600" w:hanging="360"/>
+      </w:pPr>
+      <w:rPr>
+        <w:rFonts w:ascii="Wingdings" w:hAnsi="Wingdings" w:hint="default"/>
+        <w:sz w:val="20"/>
+      </w:rPr>
+    </w:lvl>
+    <w:lvl w:ilvl="5" w:tentative="1">
+      <w:start w:val="1"/>
+      <w:numFmt w:val="bullet"/>
+      <w:lvlText w:val=""/>
+      <w:lvlJc w:val="left"/>
+      <w:pPr>
+        <w:tabs>
+          <w:tab w:val="num" w:pos="4320"/>
+        </w:tabs>
+        <w:ind w:left="4320" w:hanging="360"/>
+      </w:pPr>
+      <w:rPr>
+        <w:rFonts w:ascii="Wingdings" w:hAnsi="Wingdings" w:hint="default"/>
+        <w:sz w:val="20"/>
+      </w:rPr>
+    </w:lvl>
+    <w:lvl w:ilvl="6" w:tentative="1">
+      <w:start w:val="1"/>
+      <w:numFmt w:val="bullet"/>
+      <w:lvlText w:val=""/>
+      <w:lvlJc w:val="left"/>
+      <w:pPr>
+        <w:tabs>
+          <w:tab w:val="num" w:pos="5040"/>
+        </w:tabs>
+        <w:ind w:left="5040" w:hanging="360"/>
+      </w:pPr>
+      <w:rPr>
+        <w:rFonts w:ascii="Wingdings" w:hAnsi="Wingdings" w:hint="default"/>
+        <w:sz w:val="20"/>
+      </w:rPr>
+    </w:lvl>
+    <w:lvl w:ilvl="7" w:tentative="1">
+      <w:start w:val="1"/>
+      <w:numFmt w:val="bullet"/>
+      <w:lvlText w:val=""/>
+      <w:lvlJc w:val="left"/>
+      <w:pPr>
+        <w:tabs>
+          <w:tab w:val="num" w:pos="5760"/>
+        </w:tabs>
+        <w:ind w:left="5760" w:hanging="360"/>
+      </w:pPr>
+      <w:rPr>
+        <w:rFonts w:ascii="Wingdings" w:hAnsi="Wingdings" w:hint="default"/>
+        <w:sz w:val="20"/>
+      </w:rPr>
+    </w:lvl>
+    <w:lvl w:ilvl="8" w:tentative="1">
+      <w:start w:val="1"/>
+      <w:numFmt w:val="bullet"/>
+      <w:lvlText w:val=""/>
+      <w:lvlJc w:val="left"/>
+      <w:pPr>
+        <w:tabs>
+          <w:tab w:val="num" w:pos="6480"/>
+        </w:tabs>
+        <w:ind w:left="6480" w:hanging="360"/>
+      </w:pPr>
+      <w:rPr>
+        <w:rFonts w:ascii="Wingdings" w:hAnsi="Wingdings" w:hint="default"/>
+        <w:sz w:val="20"/>
+      </w:rPr>
+    </w:lvl>
+  </w:abstractNum>
+  <w:abstractNum w:abstractNumId="13" w15:restartNumberingAfterBreak="0">
+    <w:nsid w:val="335507D5"/>
+    <w:multiLevelType w:val="multilevel"/>
+    <w:tmpl w:val="2B5A8D3C"/>
+    <w:lvl w:ilvl="0">
+      <w:start w:val="1"/>
+      <w:numFmt w:val="decimal"/>
+      <w:lvlText w:val="%1."/>
+      <w:lvlJc w:val="left"/>
+      <w:pPr>
+        <w:tabs>
+          <w:tab w:val="num" w:pos="720"/>
+        </w:tabs>
+        <w:ind w:left="720" w:hanging="360"/>
+      </w:pPr>
+    </w:lvl>
+    <w:lvl w:ilvl="1" w:tentative="1">
+      <w:start w:val="1"/>
+      <w:numFmt w:val="decimal"/>
+      <w:lvlText w:val="%2."/>
+      <w:lvlJc w:val="left"/>
+      <w:pPr>
+        <w:tabs>
+          <w:tab w:val="num" w:pos="1440"/>
+        </w:tabs>
+        <w:ind w:left="1440" w:hanging="360"/>
+      </w:pPr>
+    </w:lvl>
+    <w:lvl w:ilvl="2" w:tentative="1">
+      <w:start w:val="1"/>
+      <w:numFmt w:val="decimal"/>
+      <w:lvlText w:val="%3."/>
+      <w:lvlJc w:val="left"/>
+      <w:pPr>
+        <w:tabs>
+          <w:tab w:val="num" w:pos="2160"/>
+        </w:tabs>
+        <w:ind w:left="2160" w:hanging="360"/>
+      </w:pPr>
+    </w:lvl>
+    <w:lvl w:ilvl="3" w:tentative="1">
+      <w:start w:val="1"/>
+      <w:numFmt w:val="decimal"/>
+      <w:lvlText w:val="%4."/>
+      <w:lvlJc w:val="left"/>
+      <w:pPr>
+        <w:tabs>
+          <w:tab w:val="num" w:pos="2880"/>
+        </w:tabs>
+        <w:ind w:left="2880" w:hanging="360"/>
+      </w:pPr>
+    </w:lvl>
+    <w:lvl w:ilvl="4" w:tentative="1">
+      <w:start w:val="1"/>
+      <w:numFmt w:val="decimal"/>
+      <w:lvlText w:val="%5."/>
+      <w:lvlJc w:val="left"/>
+      <w:pPr>
+        <w:tabs>
+          <w:tab w:val="num" w:pos="3600"/>
+        </w:tabs>
+        <w:ind w:left="3600" w:hanging="360"/>
+      </w:pPr>
+    </w:lvl>
+    <w:lvl w:ilvl="5" w:tentative="1">
+      <w:start w:val="1"/>
+      <w:numFmt w:val="decimal"/>
+      <w:lvlText w:val="%6."/>
+      <w:lvlJc w:val="left"/>
+      <w:pPr>
+        <w:tabs>
+          <w:tab w:val="num" w:pos="4320"/>
+        </w:tabs>
+        <w:ind w:left="4320" w:hanging="360"/>
+      </w:pPr>
+    </w:lvl>
+    <w:lvl w:ilvl="6" w:tentative="1">
+      <w:start w:val="1"/>
+      <w:numFmt w:val="decimal"/>
+      <w:lvlText w:val="%7."/>
+      <w:lvlJc w:val="left"/>
+      <w:pPr>
+        <w:tabs>
+          <w:tab w:val="num" w:pos="5040"/>
+        </w:tabs>
+        <w:ind w:left="5040" w:hanging="360"/>
+      </w:pPr>
+    </w:lvl>
+    <w:lvl w:ilvl="7" w:tentative="1">
+      <w:start w:val="1"/>
+      <w:numFmt w:val="decimal"/>
+      <w:lvlText w:val="%8."/>
+      <w:lvlJc w:val="left"/>
+      <w:pPr>
+        <w:tabs>
+          <w:tab w:val="num" w:pos="5760"/>
+        </w:tabs>
+        <w:ind w:left="5760" w:hanging="360"/>
+      </w:pPr>
+    </w:lvl>
+    <w:lvl w:ilvl="8" w:tentative="1">
+      <w:start w:val="1"/>
+      <w:numFmt w:val="decimal"/>
+      <w:lvlText w:val="%9."/>
+      <w:lvlJc w:val="left"/>
+      <w:pPr>
+        <w:tabs>
+          <w:tab w:val="num" w:pos="6480"/>
+        </w:tabs>
+        <w:ind w:left="6480" w:hanging="360"/>
+      </w:pPr>
+    </w:lvl>
+  </w:abstractNum>
+  <w:abstractNum w:abstractNumId="14" w15:restartNumberingAfterBreak="0">
     <w:nsid w:val="39B102EC"/>
     <w:multiLevelType w:val="hybridMultilevel"/>
     <w:tmpl w:val="85CEAB72"/>
@@ -2332,7 +3763,156 @@
       </w:rPr>
     </w:lvl>
   </w:abstractNum>
-  <w:abstractNum w:abstractNumId="12" w15:restartNumberingAfterBreak="0">
+  <w:abstractNum w:abstractNumId="15" w15:restartNumberingAfterBreak="0">
+    <w:nsid w:val="5F922860"/>
+    <w:multiLevelType w:val="multilevel"/>
+    <w:tmpl w:val="35903BBE"/>
+    <w:lvl w:ilvl="0">
+      <w:start w:val="1"/>
+      <w:numFmt w:val="bullet"/>
+      <w:lvlText w:val=""/>
+      <w:lvlJc w:val="left"/>
+      <w:pPr>
+        <w:tabs>
+          <w:tab w:val="num" w:pos="720"/>
+        </w:tabs>
+        <w:ind w:left="720" w:hanging="360"/>
+      </w:pPr>
+      <w:rPr>
+        <w:rFonts w:ascii="Symbol" w:hAnsi="Symbol" w:hint="default"/>
+        <w:sz w:val="20"/>
+      </w:rPr>
+    </w:lvl>
+    <w:lvl w:ilvl="1" w:tentative="1">
+      <w:start w:val="1"/>
+      <w:numFmt w:val="bullet"/>
+      <w:lvlText w:val="o"/>
+      <w:lvlJc w:val="left"/>
+      <w:pPr>
+        <w:tabs>
+          <w:tab w:val="num" w:pos="1440"/>
+        </w:tabs>
+        <w:ind w:left="1440" w:hanging="360"/>
+      </w:pPr>
+      <w:rPr>
+        <w:rFonts w:ascii="Courier New" w:hAnsi="Courier New" w:hint="default"/>
+        <w:sz w:val="20"/>
+      </w:rPr>
+    </w:lvl>
+    <w:lvl w:ilvl="2" w:tentative="1">
+      <w:start w:val="1"/>
+      <w:numFmt w:val="bullet"/>
+      <w:lvlText w:val=""/>
+      <w:lvlJc w:val="left"/>
+      <w:pPr>
+        <w:tabs>
+          <w:tab w:val="num" w:pos="2160"/>
+        </w:tabs>
+        <w:ind w:left="2160" w:hanging="360"/>
+      </w:pPr>
+      <w:rPr>
+        <w:rFonts w:ascii="Wingdings" w:hAnsi="Wingdings" w:hint="default"/>
+        <w:sz w:val="20"/>
+      </w:rPr>
+    </w:lvl>
+    <w:lvl w:ilvl="3" w:tentative="1">
+      <w:start w:val="1"/>
+      <w:numFmt w:val="bullet"/>
+      <w:lvlText w:val=""/>
+      <w:lvlJc w:val="left"/>
+      <w:pPr>
+        <w:tabs>
+          <w:tab w:val="num" w:pos="2880"/>
+        </w:tabs>
+        <w:ind w:left="2880" w:hanging="360"/>
+      </w:pPr>
+      <w:rPr>
+        <w:rFonts w:ascii="Wingdings" w:hAnsi="Wingdings" w:hint="default"/>
+        <w:sz w:val="20"/>
+      </w:rPr>
+    </w:lvl>
+    <w:lvl w:ilvl="4" w:tentative="1">
+      <w:start w:val="1"/>
+      <w:numFmt w:val="bullet"/>
+      <w:lvlText w:val=""/>
+      <w:lvlJc w:val="left"/>
+      <w:pPr>
+        <w:tabs>
+          <w:tab w:val="num" w:pos="3600"/>
+        </w:tabs>
+        <w:ind w:left="3600" w:hanging="360"/>
+      </w:pPr>
+      <w:rPr>
+        <w:rFonts w:ascii="Wingdings" w:hAnsi="Wingdings" w:hint="default"/>
+        <w:sz w:val="20"/>
+      </w:rPr>
+    </w:lvl>
+    <w:lvl w:ilvl="5" w:tentative="1">
+      <w:start w:val="1"/>
+      <w:numFmt w:val="bullet"/>
+      <w:lvlText w:val=""/>
+      <w:lvlJc w:val="left"/>
+      <w:pPr>
+        <w:tabs>
+          <w:tab w:val="num" w:pos="4320"/>
+        </w:tabs>
+        <w:ind w:left="4320" w:hanging="360"/>
+      </w:pPr>
+      <w:rPr>
+        <w:rFonts w:ascii="Wingdings" w:hAnsi="Wingdings" w:hint="default"/>
+        <w:sz w:val="20"/>
+      </w:rPr>
+    </w:lvl>
+    <w:lvl w:ilvl="6" w:tentative="1">
+      <w:start w:val="1"/>
+      <w:numFmt w:val="bullet"/>
+      <w:lvlText w:val=""/>
+      <w:lvlJc w:val="left"/>
+      <w:pPr>
+        <w:tabs>
+          <w:tab w:val="num" w:pos="5040"/>
+        </w:tabs>
+        <w:ind w:left="5040" w:hanging="360"/>
+      </w:pPr>
+      <w:rPr>
+        <w:rFonts w:ascii="Wingdings" w:hAnsi="Wingdings" w:hint="default"/>
+        <w:sz w:val="20"/>
+      </w:rPr>
+    </w:lvl>
+    <w:lvl w:ilvl="7" w:tentative="1">
+      <w:start w:val="1"/>
+      <w:numFmt w:val="bullet"/>
+      <w:lvlText w:val=""/>
+      <w:lvlJc w:val="left"/>
+      <w:pPr>
+        <w:tabs>
+          <w:tab w:val="num" w:pos="5760"/>
+        </w:tabs>
+        <w:ind w:left="5760" w:hanging="360"/>
+      </w:pPr>
+      <w:rPr>
+        <w:rFonts w:ascii="Wingdings" w:hAnsi="Wingdings" w:hint="default"/>
+        <w:sz w:val="20"/>
+      </w:rPr>
+    </w:lvl>
+    <w:lvl w:ilvl="8" w:tentative="1">
+      <w:start w:val="1"/>
+      <w:numFmt w:val="bullet"/>
+      <w:lvlText w:val=""/>
+      <w:lvlJc w:val="left"/>
+      <w:pPr>
+        <w:tabs>
+          <w:tab w:val="num" w:pos="6480"/>
+        </w:tabs>
+        <w:ind w:left="6480" w:hanging="360"/>
+      </w:pPr>
+      <w:rPr>
+        <w:rFonts w:ascii="Wingdings" w:hAnsi="Wingdings" w:hint="default"/>
+        <w:sz w:val="20"/>
+      </w:rPr>
+    </w:lvl>
+  </w:abstractNum>
+  <w:abstractNum w:abstractNumId="16" w15:restartNumberingAfterBreak="0">
     <w:nsid w:val="6AB31725"/>
     <w:multiLevelType w:val="hybridMultilevel"/>
     <w:tmpl w:val="1C36B292"/>
@@ -2443,6 +4023,119 @@
       <w:rPr>
         <w:rFonts w:ascii="Wingdings" w:hAnsi="Wingdings" w:hint="default"/>
       </w:rPr>
+    </w:lvl>
+  </w:abstractNum>
+  <w:abstractNum w:abstractNumId="17" w15:restartNumberingAfterBreak="0">
+    <w:nsid w:val="7EB94E7A"/>
+    <w:multiLevelType w:val="multilevel"/>
+    <w:tmpl w:val="BAB678C0"/>
+    <w:lvl w:ilvl="0">
+      <w:start w:val="6"/>
+      <w:numFmt w:val="decimal"/>
+      <w:lvlText w:val="%1."/>
+      <w:lvlJc w:val="left"/>
+      <w:pPr>
+        <w:tabs>
+          <w:tab w:val="num" w:pos="720"/>
+        </w:tabs>
+        <w:ind w:left="720" w:hanging="360"/>
+      </w:pPr>
+    </w:lvl>
+    <w:lvl w:ilvl="1" w:tentative="1">
+      <w:start w:val="1"/>
+      <w:numFmt w:val="decimal"/>
+      <w:lvlText w:val="%2."/>
+      <w:lvlJc w:val="left"/>
+      <w:pPr>
+        <w:tabs>
+          <w:tab w:val="num" w:pos="1440"/>
+        </w:tabs>
+        <w:ind w:left="1440" w:hanging="360"/>
+      </w:pPr>
+    </w:lvl>
+    <w:lvl w:ilvl="2" w:tentative="1">
+      <w:start w:val="1"/>
+      <w:numFmt w:val="decimal"/>
+      <w:lvlText w:val="%3."/>
+      <w:lvlJc w:val="left"/>
+      <w:pPr>
+        <w:tabs>
+          <w:tab w:val="num" w:pos="2160"/>
+        </w:tabs>
+        <w:ind w:left="2160" w:hanging="360"/>
+      </w:pPr>
+    </w:lvl>
+    <w:lvl w:ilvl="3" w:tentative="1">
+      <w:start w:val="1"/>
+      <w:numFmt w:val="decimal"/>
+      <w:lvlText w:val="%4."/>
+      <w:lvlJc w:val="left"/>
+      <w:pPr>
+        <w:tabs>
+          <w:tab w:val="num" w:pos="2880"/>
+        </w:tabs>
+        <w:ind w:left="2880" w:hanging="360"/>
+      </w:pPr>
+    </w:lvl>
+    <w:lvl w:ilvl="4" w:tentative="1">
+      <w:start w:val="1"/>
+      <w:numFmt w:val="decimal"/>
+      <w:lvlText w:val="%5."/>
+      <w:lvlJc w:val="left"/>
+      <w:pPr>
+        <w:tabs>
+          <w:tab w:val="num" w:pos="3600"/>
+        </w:tabs>
+        <w:ind w:left="3600" w:hanging="360"/>
+      </w:pPr>
+    </w:lvl>
+    <w:lvl w:ilvl="5" w:tentative="1">
+      <w:start w:val="1"/>
+      <w:numFmt w:val="decimal"/>
+      <w:lvlText w:val="%6."/>
+      <w:lvlJc w:val="left"/>
+      <w:pPr>
+        <w:tabs>
+          <w:tab w:val="num" w:pos="4320"/>
+        </w:tabs>
+        <w:ind w:left="4320" w:hanging="360"/>
+      </w:pPr>
+    </w:lvl>
+    <w:lvl w:ilvl="6" w:tentative="1">
+      <w:start w:val="1"/>
+      <w:numFmt w:val="decimal"/>
+      <w:lvlText w:val="%7."/>
+      <w:lvlJc w:val="left"/>
+      <w:pPr>
+        <w:tabs>
+          <w:tab w:val="num" w:pos="5040"/>
+        </w:tabs>
+        <w:ind w:left="5040" w:hanging="360"/>
+      </w:pPr>
+    </w:lvl>
+    <w:lvl w:ilvl="7" w:tentative="1">
+      <w:start w:val="1"/>
+      <w:numFmt w:val="decimal"/>
+      <w:lvlText w:val="%8."/>
+      <w:lvlJc w:val="left"/>
+      <w:pPr>
+        <w:tabs>
+          <w:tab w:val="num" w:pos="5760"/>
+        </w:tabs>
+        <w:ind w:left="5760" w:hanging="360"/>
+      </w:pPr>
+    </w:lvl>
+    <w:lvl w:ilvl="8" w:tentative="1">
+      <w:start w:val="1"/>
+      <w:numFmt w:val="decimal"/>
+      <w:lvlText w:val="%9."/>
+      <w:lvlJc w:val="left"/>
+      <w:pPr>
+        <w:tabs>
+          <w:tab w:val="num" w:pos="6480"/>
+        </w:tabs>
+        <w:ind w:left="6480" w:hanging="360"/>
+      </w:pPr>
     </w:lvl>
   </w:abstractNum>
   <w:num w:numId="1" w16cid:durableId="1360862602">
@@ -2473,16 +4166,31 @@
     <w:abstractNumId w:val="0"/>
   </w:num>
   <w:num w:numId="10" w16cid:durableId="300767012">
+    <w:abstractNumId w:val="14"/>
+  </w:num>
+  <w:num w:numId="11" w16cid:durableId="796877494">
     <w:abstractNumId w:val="11"/>
   </w:num>
-  <w:num w:numId="11" w16cid:durableId="796877494">
+  <w:num w:numId="12" w16cid:durableId="1946229357">
+    <w:abstractNumId w:val="16"/>
+  </w:num>
+  <w:num w:numId="13" w16cid:durableId="1037046858">
     <w:abstractNumId w:val="10"/>
   </w:num>
-  <w:num w:numId="12" w16cid:durableId="1946229357">
+  <w:num w:numId="14" w16cid:durableId="948705894">
+    <w:abstractNumId w:val="9"/>
+  </w:num>
+  <w:num w:numId="15" w16cid:durableId="935938344">
+    <w:abstractNumId w:val="15"/>
+  </w:num>
+  <w:num w:numId="16" w16cid:durableId="99879713">
     <w:abstractNumId w:val="12"/>
   </w:num>
-  <w:num w:numId="13" w16cid:durableId="1037046858">
-    <w:abstractNumId w:val="9"/>
+  <w:num w:numId="17" w16cid:durableId="1553038397">
+    <w:abstractNumId w:val="13"/>
+  </w:num>
+  <w:num w:numId="18" w16cid:durableId="2107380813">
+    <w:abstractNumId w:val="17"/>
   </w:num>
 </w:numbering>
 </file>
@@ -14230,6 +15938,21 @@
 </file>
 
 <file path=customXml/item1.xml><?xml version="1.0" encoding="utf-8"?>
+<?mso-contentType ?>
+<FormTemplates xmlns="http://schemas.microsoft.com/sharepoint/v3/contenttype/forms">
+  <Display>DocumentLibraryForm</Display>
+  <Edit>DocumentLibraryForm</Edit>
+  <New>DocumentLibraryForm</New>
+</FormTemplates>
+</file>
+
+<file path=customXml/item2.xml><?xml version="1.0" encoding="utf-8"?>
+<p:properties xmlns:p="http://schemas.microsoft.com/office/2006/metadata/properties" xmlns:xsi="http://www.w3.org/2001/XMLSchema-instance" xmlns:pc="http://schemas.microsoft.com/office/infopath/2007/PartnerControls">
+  <documentManagement/>
+</p:properties>
+</file>
+
+<file path=customXml/item3.xml><?xml version="1.0" encoding="utf-8"?>
 <ct:contentTypeSchema xmlns:ct="http://schemas.microsoft.com/office/2006/metadata/contentType" xmlns:ma="http://schemas.microsoft.com/office/2006/metadata/properties/metaAttributes" ct:_="" ma:_="" ma:contentTypeName="Documento" ma:contentTypeID="0x010100F8607851842AA94CB8F5AD47B8F0A599" ma:contentTypeVersion="7" ma:contentTypeDescription="Crie um novo documento." ma:contentTypeScope="" ma:versionID="0822dc124d63ea3698da086c0812f568">
   <xsd:schema xmlns:xsd="http://www.w3.org/2001/XMLSchema" xmlns:xs="http://www.w3.org/2001/XMLSchema" xmlns:p="http://schemas.microsoft.com/office/2006/metadata/properties" xmlns:ns2="a76ddac3-4fba-4281-bfc8-c64077ed4909" targetNamespace="http://schemas.microsoft.com/office/2006/metadata/properties" ma:root="true" ma:fieldsID="fdf84e3a836cc2e33b639c8d2d440e2e" ns2:_="">
     <xsd:import namespace="a76ddac3-4fba-4281-bfc8-c64077ed4909"/>
@@ -14391,26 +16114,28 @@
 </ct:contentTypeSchema>
 </file>
 
-<file path=customXml/item2.xml><?xml version="1.0" encoding="utf-8"?>
-<p:properties xmlns:p="http://schemas.microsoft.com/office/2006/metadata/properties" xmlns:xsi="http://www.w3.org/2001/XMLSchema-instance" xmlns:pc="http://schemas.microsoft.com/office/infopath/2007/PartnerControls">
-  <documentManagement/>
-</p:properties>
-</file>
-
-<file path=customXml/item3.xml><?xml version="1.0" encoding="utf-8"?>
-<?mso-contentType ?>
-<FormTemplates xmlns="http://schemas.microsoft.com/sharepoint/v3/contenttype/forms">
-  <Display>DocumentLibraryForm</Display>
-  <Edit>DocumentLibraryForm</Edit>
-  <New>DocumentLibraryForm</New>
-</FormTemplates>
-</file>
-
 <file path=customXml/item4.xml><?xml version="1.0" encoding="utf-8"?>
 <b:Sources xmlns:b="http://schemas.openxmlformats.org/officeDocument/2006/bibliography" xmlns="http://schemas.openxmlformats.org/officeDocument/2006/bibliography" SelectedStyle="/APA.XSL" StyleName="APA"/>
 </file>
 
 <file path=customXml/itemProps1.xml><?xml version="1.0" encoding="utf-8"?>
+<ds:datastoreItem xmlns:ds="http://schemas.openxmlformats.org/officeDocument/2006/customXml" ds:itemID="{27179BEA-02FB-4073-9470-283143D7E6C2}">
+  <ds:schemaRefs>
+    <ds:schemaRef ds:uri="http://schemas.microsoft.com/sharepoint/v3/contenttype/forms"/>
+  </ds:schemaRefs>
+</ds:datastoreItem>
+</file>
+
+<file path=customXml/itemProps2.xml><?xml version="1.0" encoding="utf-8"?>
+<ds:datastoreItem xmlns:ds="http://schemas.openxmlformats.org/officeDocument/2006/customXml" ds:itemID="{D67E87B2-3985-4FF0-A239-AD9892F73691}">
+  <ds:schemaRefs>
+    <ds:schemaRef ds:uri="http://schemas.microsoft.com/office/2006/metadata/properties"/>
+    <ds:schemaRef ds:uri="http://schemas.microsoft.com/office/infopath/2007/PartnerControls"/>
+  </ds:schemaRefs>
+</ds:datastoreItem>
+</file>
+
+<file path=customXml/itemProps3.xml><?xml version="1.0" encoding="utf-8"?>
 <ds:datastoreItem xmlns:ds="http://schemas.openxmlformats.org/officeDocument/2006/customXml" ds:itemID="{7F7B81F8-7DC2-4FAB-9A4D-2B3FC8082C2F}">
   <ds:schemaRefs>
     <ds:schemaRef ds:uri="http://schemas.microsoft.com/office/2006/metadata/contentType"/>
@@ -14428,23 +16153,6 @@
 </ds:datastoreItem>
 </file>
 
-<file path=customXml/itemProps2.xml><?xml version="1.0" encoding="utf-8"?>
-<ds:datastoreItem xmlns:ds="http://schemas.openxmlformats.org/officeDocument/2006/customXml" ds:itemID="{D67E87B2-3985-4FF0-A239-AD9892F73691}">
-  <ds:schemaRefs>
-    <ds:schemaRef ds:uri="http://schemas.microsoft.com/office/2006/metadata/properties"/>
-    <ds:schemaRef ds:uri="http://schemas.microsoft.com/office/infopath/2007/PartnerControls"/>
-  </ds:schemaRefs>
-</ds:datastoreItem>
-</file>
-
-<file path=customXml/itemProps3.xml><?xml version="1.0" encoding="utf-8"?>
-<ds:datastoreItem xmlns:ds="http://schemas.openxmlformats.org/officeDocument/2006/customXml" ds:itemID="{27179BEA-02FB-4073-9470-283143D7E6C2}">
-  <ds:schemaRefs>
-    <ds:schemaRef ds:uri="http://schemas.microsoft.com/sharepoint/v3/contenttype/forms"/>
-  </ds:schemaRefs>
-</ds:datastoreItem>
-</file>
-
 <file path=customXml/itemProps4.xml><?xml version="1.0" encoding="utf-8"?>
 <ds:datastoreItem xmlns:ds="http://schemas.openxmlformats.org/officeDocument/2006/customXml" ds:itemID="{EF278816-EC6F-A645-907D-7F25AECB1D4A}">
   <ds:schemaRefs>

</xml_diff>

<commit_message>
Atualização do readme, e manuais.
</commit_message>
<xml_diff>
--- a/Manual_Desenvolvedor_Achados_e_Perdidos.docx
+++ b/Manual_Desenvolvedor_Achados_e_Perdidos.docx
@@ -158,7 +158,23 @@
         <w:pStyle w:val="Commarcadores"/>
       </w:pPr>
       <w:r>
-        <w:t xml:space="preserve">Ollama: Serviço responsável por executar o </w:t>
+        <w:t xml:space="preserve">Ollama: Serviço responsável </w:t>
+      </w:r>
+      <w:proofErr w:type="spellStart"/>
+      <w:r>
+        <w:t>por</w:t>
+      </w:r>
+      <w:proofErr w:type="spellEnd"/>
+      <w:r>
+        <w:t xml:space="preserve"> </w:t>
+      </w:r>
+      <w:proofErr w:type="spellStart"/>
+      <w:r>
+        <w:t>executar</w:t>
+      </w:r>
+      <w:proofErr w:type="spellEnd"/>
+      <w:r>
+        <w:t xml:space="preserve"> o </w:t>
       </w:r>
       <w:proofErr w:type="spellStart"/>
       <w:r>
@@ -608,10 +624,7 @@
         <w:pStyle w:val="Ttulo2"/>
       </w:pPr>
       <w:r>
-        <w:t>3</w:t>
-      </w:r>
-      <w:r>
-        <w:t xml:space="preserve">. </w:t>
+        <w:t xml:space="preserve">3. </w:t>
       </w:r>
       <w:proofErr w:type="spellStart"/>
       <w:r>
@@ -1835,6 +1848,7 @@
         </w:rPr>
         <w:t>env</w:t>
       </w:r>
+      <w:proofErr w:type="spellEnd"/>
       <w:proofErr w:type="gramEnd"/>
       <w:r>
         <w:rPr>
@@ -1842,16 +1856,23 @@
           <w:color w:val="000000" w:themeColor="text1"/>
           <w:lang w:val="pt-BR"/>
         </w:rPr>
-        <w:t>.example</w:t>
-      </w:r>
-      <w:proofErr w:type="spellEnd"/>
+        <w:t xml:space="preserve">" fornecido no </w:t>
+      </w:r>
       <w:r>
         <w:rPr>
           <w:rFonts w:asciiTheme="majorHAnsi" w:eastAsiaTheme="majorEastAsia" w:hAnsiTheme="majorHAnsi" w:cstheme="majorBidi"/>
           <w:color w:val="000000" w:themeColor="text1"/>
           <w:lang w:val="pt-BR"/>
         </w:rPr>
-        <w:t>" fornecido no repositório. Três variáveis possuem caráter crítico de segurança e devem ser geradas de forma isolada:</w:t>
+        <w:t>README</w:t>
+      </w:r>
+      <w:r>
+        <w:rPr>
+          <w:rFonts w:asciiTheme="majorHAnsi" w:eastAsiaTheme="majorEastAsia" w:hAnsiTheme="majorHAnsi" w:cstheme="majorBidi"/>
+          <w:color w:val="000000" w:themeColor="text1"/>
+          <w:lang w:val="pt-BR"/>
+        </w:rPr>
+        <w:t>. Três variáveis possuem caráter crítico de segurança e devem ser geradas de forma isolada:</w:t>
       </w:r>
     </w:p>
     <w:p>
@@ -2234,7 +2255,32 @@
           <w:color w:val="000000" w:themeColor="text1"/>
           <w:lang w:val="pt-BR"/>
         </w:rPr>
-        <w:t xml:space="preserve">: I. Clonar o repositório: </w:t>
+        <w:t>:</w:t>
+      </w:r>
+      <w:r>
+        <w:rPr>
+          <w:rFonts w:asciiTheme="majorHAnsi" w:eastAsiaTheme="majorEastAsia" w:hAnsiTheme="majorHAnsi" w:cstheme="majorBidi"/>
+          <w:color w:val="000000" w:themeColor="text1"/>
+          <w:lang w:val="pt-BR"/>
+        </w:rPr>
+        <w:t xml:space="preserve"> </w:t>
+      </w:r>
+    </w:p>
+    <w:p>
+      <w:pPr>
+        <w:rPr>
+          <w:rFonts w:asciiTheme="majorHAnsi" w:eastAsiaTheme="majorEastAsia" w:hAnsiTheme="majorHAnsi" w:cstheme="majorBidi"/>
+          <w:color w:val="000000" w:themeColor="text1"/>
+          <w:lang w:val="pt-BR"/>
+        </w:rPr>
+      </w:pPr>
+      <w:r>
+        <w:rPr>
+          <w:rFonts w:asciiTheme="majorHAnsi" w:eastAsiaTheme="majorEastAsia" w:hAnsiTheme="majorHAnsi" w:cstheme="majorBidi"/>
+          <w:color w:val="000000" w:themeColor="text1"/>
+          <w:lang w:val="pt-BR"/>
+        </w:rPr>
+        <w:t xml:space="preserve">I. Clonar o repositório: </w:t>
       </w:r>
       <w:proofErr w:type="spellStart"/>
       <w:r>
@@ -2365,7 +2411,7 @@
           <w:color w:val="000000" w:themeColor="text1"/>
           <w:lang w:val="pt-BR"/>
         </w:rPr>
-        <w:t>docker-compose</w:t>
+        <w:t>docker</w:t>
       </w:r>
       <w:proofErr w:type="spellEnd"/>
       <w:r>
@@ -2383,7 +2429,7 @@
           <w:color w:val="000000" w:themeColor="text1"/>
           <w:lang w:val="pt-BR"/>
         </w:rPr>
-        <w:t>up</w:t>
+        <w:t>compose</w:t>
       </w:r>
       <w:proofErr w:type="spellEnd"/>
       <w:r>
@@ -2392,7 +2438,57 @@
           <w:color w:val="000000" w:themeColor="text1"/>
           <w:lang w:val="pt-BR"/>
         </w:rPr>
-        <w:t xml:space="preserve"> --build (O processo pode levar de 8 a 10 minutos. Caso seja um </w:t>
+        <w:t xml:space="preserve"> </w:t>
+      </w:r>
+      <w:proofErr w:type="spellStart"/>
+      <w:r>
+        <w:rPr>
+          <w:rFonts w:asciiTheme="majorHAnsi" w:eastAsiaTheme="majorEastAsia" w:hAnsiTheme="majorHAnsi" w:cstheme="majorBidi"/>
+          <w:color w:val="000000" w:themeColor="text1"/>
+          <w:lang w:val="pt-BR"/>
+        </w:rPr>
+        <w:t>up</w:t>
+      </w:r>
+      <w:proofErr w:type="spellEnd"/>
+      <w:r>
+        <w:rPr>
+          <w:rFonts w:asciiTheme="majorHAnsi" w:eastAsiaTheme="majorEastAsia" w:hAnsiTheme="majorHAnsi" w:cstheme="majorBidi"/>
+          <w:color w:val="000000" w:themeColor="text1"/>
+          <w:lang w:val="pt-BR"/>
+        </w:rPr>
+        <w:t xml:space="preserve"> --build (O processo</w:t>
+      </w:r>
+      <w:r>
+        <w:rPr>
+          <w:rFonts w:asciiTheme="majorHAnsi" w:eastAsiaTheme="majorEastAsia" w:hAnsiTheme="majorHAnsi" w:cstheme="majorBidi"/>
+          <w:color w:val="000000" w:themeColor="text1"/>
+          <w:lang w:val="pt-BR"/>
+        </w:rPr>
+        <w:t xml:space="preserve"> vai</w:t>
+      </w:r>
+      <w:r>
+        <w:rPr>
+          <w:rFonts w:asciiTheme="majorHAnsi" w:eastAsiaTheme="majorEastAsia" w:hAnsiTheme="majorHAnsi" w:cstheme="majorBidi"/>
+          <w:color w:val="000000" w:themeColor="text1"/>
+          <w:lang w:val="pt-BR"/>
+        </w:rPr>
+        <w:t xml:space="preserve"> levar </w:t>
+      </w:r>
+      <w:r>
+        <w:rPr>
+          <w:rFonts w:asciiTheme="majorHAnsi" w:eastAsiaTheme="majorEastAsia" w:hAnsiTheme="majorHAnsi" w:cstheme="majorBidi"/>
+          <w:color w:val="000000" w:themeColor="text1"/>
+          <w:lang w:val="pt-BR"/>
+        </w:rPr>
+        <w:t>alguns</w:t>
+      </w:r>
+      <w:r>
+        <w:rPr>
+          <w:rFonts w:asciiTheme="majorHAnsi" w:eastAsiaTheme="majorEastAsia" w:hAnsiTheme="majorHAnsi" w:cstheme="majorBidi"/>
+          <w:color w:val="000000" w:themeColor="text1"/>
+          <w:lang w:val="pt-BR"/>
+        </w:rPr>
+        <w:t xml:space="preserve"> minutos. Caso seja um </w:t>
       </w:r>
       <w:proofErr w:type="spellStart"/>
       <w:r>
@@ -4798,6 +4894,7 @@
   <w:style w:type="character" w:default="1" w:styleId="Fontepargpadro">
     <w:name w:val="Default Paragraph Font"/>
     <w:uiPriority w:val="1"/>
+    <w:semiHidden/>
     <w:unhideWhenUsed/>
   </w:style>
   <w:style w:type="table" w:default="1" w:styleId="Tabelanormal">
@@ -15938,21 +16035,6 @@
 </file>
 
 <file path=customXml/item1.xml><?xml version="1.0" encoding="utf-8"?>
-<?mso-contentType ?>
-<FormTemplates xmlns="http://schemas.microsoft.com/sharepoint/v3/contenttype/forms">
-  <Display>DocumentLibraryForm</Display>
-  <Edit>DocumentLibraryForm</Edit>
-  <New>DocumentLibraryForm</New>
-</FormTemplates>
-</file>
-
-<file path=customXml/item2.xml><?xml version="1.0" encoding="utf-8"?>
-<p:properties xmlns:p="http://schemas.microsoft.com/office/2006/metadata/properties" xmlns:xsi="http://www.w3.org/2001/XMLSchema-instance" xmlns:pc="http://schemas.microsoft.com/office/infopath/2007/PartnerControls">
-  <documentManagement/>
-</p:properties>
-</file>
-
-<file path=customXml/item3.xml><?xml version="1.0" encoding="utf-8"?>
 <ct:contentTypeSchema xmlns:ct="http://schemas.microsoft.com/office/2006/metadata/contentType" xmlns:ma="http://schemas.microsoft.com/office/2006/metadata/properties/metaAttributes" ct:_="" ma:_="" ma:contentTypeName="Documento" ma:contentTypeID="0x010100F8607851842AA94CB8F5AD47B8F0A599" ma:contentTypeVersion="7" ma:contentTypeDescription="Crie um novo documento." ma:contentTypeScope="" ma:versionID="0822dc124d63ea3698da086c0812f568">
   <xsd:schema xmlns:xsd="http://www.w3.org/2001/XMLSchema" xmlns:xs="http://www.w3.org/2001/XMLSchema" xmlns:p="http://schemas.microsoft.com/office/2006/metadata/properties" xmlns:ns2="a76ddac3-4fba-4281-bfc8-c64077ed4909" targetNamespace="http://schemas.microsoft.com/office/2006/metadata/properties" ma:root="true" ma:fieldsID="fdf84e3a836cc2e33b639c8d2d440e2e" ns2:_="">
     <xsd:import namespace="a76ddac3-4fba-4281-bfc8-c64077ed4909"/>
@@ -16114,28 +16196,26 @@
 </ct:contentTypeSchema>
 </file>
 
+<file path=customXml/item2.xml><?xml version="1.0" encoding="utf-8"?>
+<p:properties xmlns:p="http://schemas.microsoft.com/office/2006/metadata/properties" xmlns:xsi="http://www.w3.org/2001/XMLSchema-instance" xmlns:pc="http://schemas.microsoft.com/office/infopath/2007/PartnerControls">
+  <documentManagement/>
+</p:properties>
+</file>
+
+<file path=customXml/item3.xml><?xml version="1.0" encoding="utf-8"?>
+<?mso-contentType ?>
+<FormTemplates xmlns="http://schemas.microsoft.com/sharepoint/v3/contenttype/forms">
+  <Display>DocumentLibraryForm</Display>
+  <Edit>DocumentLibraryForm</Edit>
+  <New>DocumentLibraryForm</New>
+</FormTemplates>
+</file>
+
 <file path=customXml/item4.xml><?xml version="1.0" encoding="utf-8"?>
 <b:Sources xmlns:b="http://schemas.openxmlformats.org/officeDocument/2006/bibliography" xmlns="http://schemas.openxmlformats.org/officeDocument/2006/bibliography" SelectedStyle="/APA.XSL" StyleName="APA"/>
 </file>
 
 <file path=customXml/itemProps1.xml><?xml version="1.0" encoding="utf-8"?>
-<ds:datastoreItem xmlns:ds="http://schemas.openxmlformats.org/officeDocument/2006/customXml" ds:itemID="{27179BEA-02FB-4073-9470-283143D7E6C2}">
-  <ds:schemaRefs>
-    <ds:schemaRef ds:uri="http://schemas.microsoft.com/sharepoint/v3/contenttype/forms"/>
-  </ds:schemaRefs>
-</ds:datastoreItem>
-</file>
-
-<file path=customXml/itemProps2.xml><?xml version="1.0" encoding="utf-8"?>
-<ds:datastoreItem xmlns:ds="http://schemas.openxmlformats.org/officeDocument/2006/customXml" ds:itemID="{D67E87B2-3985-4FF0-A239-AD9892F73691}">
-  <ds:schemaRefs>
-    <ds:schemaRef ds:uri="http://schemas.microsoft.com/office/2006/metadata/properties"/>
-    <ds:schemaRef ds:uri="http://schemas.microsoft.com/office/infopath/2007/PartnerControls"/>
-  </ds:schemaRefs>
-</ds:datastoreItem>
-</file>
-
-<file path=customXml/itemProps3.xml><?xml version="1.0" encoding="utf-8"?>
 <ds:datastoreItem xmlns:ds="http://schemas.openxmlformats.org/officeDocument/2006/customXml" ds:itemID="{7F7B81F8-7DC2-4FAB-9A4D-2B3FC8082C2F}">
   <ds:schemaRefs>
     <ds:schemaRef ds:uri="http://schemas.microsoft.com/office/2006/metadata/contentType"/>
@@ -16153,6 +16233,23 @@
 </ds:datastoreItem>
 </file>
 
+<file path=customXml/itemProps2.xml><?xml version="1.0" encoding="utf-8"?>
+<ds:datastoreItem xmlns:ds="http://schemas.openxmlformats.org/officeDocument/2006/customXml" ds:itemID="{D67E87B2-3985-4FF0-A239-AD9892F73691}">
+  <ds:schemaRefs>
+    <ds:schemaRef ds:uri="http://schemas.microsoft.com/office/2006/metadata/properties"/>
+    <ds:schemaRef ds:uri="http://schemas.microsoft.com/office/infopath/2007/PartnerControls"/>
+  </ds:schemaRefs>
+</ds:datastoreItem>
+</file>
+
+<file path=customXml/itemProps3.xml><?xml version="1.0" encoding="utf-8"?>
+<ds:datastoreItem xmlns:ds="http://schemas.openxmlformats.org/officeDocument/2006/customXml" ds:itemID="{27179BEA-02FB-4073-9470-283143D7E6C2}">
+  <ds:schemaRefs>
+    <ds:schemaRef ds:uri="http://schemas.microsoft.com/sharepoint/v3/contenttype/forms"/>
+  </ds:schemaRefs>
+</ds:datastoreItem>
+</file>
+
 <file path=customXml/itemProps4.xml><?xml version="1.0" encoding="utf-8"?>
 <ds:datastoreItem xmlns:ds="http://schemas.openxmlformats.org/officeDocument/2006/customXml" ds:itemID="{EF278816-EC6F-A645-907D-7F25AECB1D4A}">
   <ds:schemaRefs>

</xml_diff>